<commit_message>
migrate 16 course syllabi to assessment structure (20/20/60); add change diffs + validation reports
</commit_message>
<xml_diff>
--- a/course/专业英语（智能制造）/2025/大纲/25JD31405-专业英语（智能制造）-课程教学大纲.docx
+++ b/course/专业英语（智能制造）/2025/大纲/25JD31405-专业英语（智能制造）-课程教学大纲.docx
@@ -4532,15 +4532,13 @@
               <w:spacing w:before="0" w:after="0" w:line="240" w:lineRule="auto"/>
               <w:jc w:val="center"/>
             </w:pPr>
-            <w:r/>
             <w:r>
               <w:rPr>
-                <w:rFonts w:ascii="Times New Roman" w:hAnsi="Times New Roman" w:cs="Times New Roman" w:eastAsia="宋体" w:hint="eastAsia"/>
+                <w:rFonts w:ascii="Times New Roman" w:hAnsi="Times New Roman" w:eastAsia="宋体"/>
                 <w:b/>
-                <w:sz w:val="15"/>
-                <w:lang w:eastAsia="zh-CN"/>
+                <w:sz w:val="16"/>
               </w:rPr>
-              <w:t>专业阅读与术语任务（25%）</w:t>
+              <w:t>平时成绩（20%）</w:t>
             </w:r>
           </w:p>
         </w:tc>
@@ -4560,15 +4558,13 @@
               <w:spacing w:before="0" w:after="0" w:line="240" w:lineRule="auto"/>
               <w:jc w:val="center"/>
             </w:pPr>
-            <w:r/>
             <w:r>
               <w:rPr>
-                <w:rFonts w:ascii="Times New Roman" w:hAnsi="Times New Roman" w:cs="Times New Roman" w:eastAsia="宋体" w:hint="eastAsia"/>
+                <w:rFonts w:ascii="Times New Roman" w:hAnsi="Times New Roman" w:eastAsia="宋体"/>
                 <w:b/>
-                <w:sz w:val="15"/>
-                <w:lang w:eastAsia="zh-CN"/>
+                <w:sz w:val="16"/>
               </w:rPr>
-              <w:t>翻译与技术写作任务（25%）</w:t>
+              <w:t>课程作业（20%）</w:t>
             </w:r>
           </w:p>
         </w:tc>
@@ -4588,15 +4584,13 @@
               <w:spacing w:before="0" w:after="0" w:line="240" w:lineRule="auto"/>
               <w:jc w:val="center"/>
             </w:pPr>
-            <w:r/>
             <w:r>
               <w:rPr>
-                <w:rFonts w:ascii="Times New Roman" w:hAnsi="Times New Roman" w:cs="Times New Roman" w:eastAsia="宋体" w:hint="eastAsia"/>
+                <w:rFonts w:ascii="Times New Roman" w:hAnsi="Times New Roman" w:eastAsia="宋体"/>
                 <w:b/>
-                <w:sz w:val="15"/>
-                <w:lang w:eastAsia="zh-CN"/>
+                <w:sz w:val="16"/>
               </w:rPr>
-              <w:t>综合英文技术沟通项目（35%）</w:t>
+              <w:t>期末考核（60%）</w:t>
             </w:r>
           </w:p>
         </w:tc>
@@ -4622,61 +4616,38 @@
         <w:tc>
           <w:tcPr>
             <w:tcW w:type="dxa" w:w="1600"/>
-          </w:tcPr>
-          <w:p>
-            <w:pPr>
-              <w:spacing w:before="0" w:after="0" w:line="240" w:lineRule="auto"/>
-              <w:jc w:val="left"/>
-            </w:pPr>
-            <w:r/>
-            <w:r>
-              <w:rPr>
-                <w:rFonts w:ascii="Times New Roman" w:hAnsi="Times New Roman" w:cs="Times New Roman" w:eastAsia="宋体" w:hint="eastAsia"/>
-                <w:b/>
-                <w:sz w:val="15"/>
-                <w:lang w:eastAsia="zh-CN"/>
-              </w:rPr>
-              <w:t>第一单元 专业英语基础与术语管理</w:t>
-            </w:r>
-          </w:p>
-        </w:tc>
-        <w:tc>
-          <w:tcPr>
-            <w:tcW w:type="dxa" w:w="650"/>
+            <w:vAlign w:val="center"/>
           </w:tcPr>
           <w:p>
             <w:pPr>
               <w:spacing w:before="0" w:after="0" w:line="240" w:lineRule="auto"/>
               <w:jc w:val="center"/>
             </w:pPr>
-            <w:r/>
             <w:r>
               <w:rPr>
-                <w:rFonts w:ascii="Times New Roman" w:hAnsi="Times New Roman" w:cs="Times New Roman" w:eastAsia="宋体" w:hint="eastAsia"/>
-                <w:b w:val="0"/>
-                <w:sz w:val="15"/>
-                <w:lang w:eastAsia="zh-CN"/>
+                <w:rFonts w:ascii="Times New Roman" w:hAnsi="Times New Roman" w:eastAsia="宋体"/>
+                <w:b/>
+                <w:sz w:val="16"/>
               </w:rPr>
-              <w:t>4</w:t>
+              <w:t>第一单元 专业英语基础与术语管理</w:t>
             </w:r>
           </w:p>
         </w:tc>
         <w:tc>
           <w:tcPr>
             <w:tcW w:type="dxa" w:w="650"/>
+            <w:vAlign w:val="center"/>
           </w:tcPr>
           <w:p>
             <w:pPr>
               <w:spacing w:before="0" w:after="0" w:line="240" w:lineRule="auto"/>
               <w:jc w:val="center"/>
             </w:pPr>
-            <w:r/>
             <w:r>
               <w:rPr>
-                <w:rFonts w:ascii="Times New Roman" w:hAnsi="Times New Roman" w:cs="Times New Roman" w:eastAsia="宋体" w:hint="eastAsia"/>
+                <w:rFonts w:ascii="Times New Roman" w:hAnsi="Times New Roman" w:eastAsia="宋体"/>
                 <w:b w:val="0"/>
-                <w:sz w:val="15"/>
-                <w:lang w:eastAsia="zh-CN"/>
+                <w:sz w:val="16"/>
               </w:rPr>
               <w:t>4</w:t>
             </w:r>
@@ -4684,83 +4655,99 @@
         </w:tc>
         <w:tc>
           <w:tcPr>
-            <w:tcW w:type="dxa" w:w="1100"/>
+            <w:tcW w:type="dxa" w:w="650"/>
+            <w:vAlign w:val="center"/>
           </w:tcPr>
           <w:p>
             <w:pPr>
               <w:spacing w:before="0" w:after="0" w:line="240" w:lineRule="auto"/>
               <w:jc w:val="center"/>
             </w:pPr>
-            <w:r/>
             <w:r>
               <w:rPr>
-                <w:rFonts w:ascii="Times New Roman" w:hAnsi="Times New Roman" w:cs="Times New Roman" w:eastAsia="宋体" w:hint="eastAsia"/>
+                <w:rFonts w:ascii="Times New Roman" w:hAnsi="Times New Roman" w:eastAsia="宋体"/>
                 <w:b w:val="0"/>
-                <w:sz w:val="15"/>
-                <w:lang w:eastAsia="zh-CN"/>
+                <w:sz w:val="16"/>
               </w:rPr>
-              <w:t>20%</w:t>
+              <w:t>4</w:t>
             </w:r>
           </w:p>
         </w:tc>
         <w:tc>
           <w:tcPr>
             <w:tcW w:type="dxa" w:w="1100"/>
+            <w:vAlign w:val="center"/>
           </w:tcPr>
           <w:p>
             <w:pPr>
               <w:spacing w:before="0" w:after="0" w:line="240" w:lineRule="auto"/>
               <w:jc w:val="center"/>
             </w:pPr>
-            <w:r/>
             <w:r>
               <w:rPr>
-                <w:rFonts w:ascii="Times New Roman" w:hAnsi="Times New Roman" w:cs="Times New Roman" w:eastAsia="宋体" w:hint="eastAsia"/>
+                <w:rFonts w:ascii="Times New Roman" w:hAnsi="Times New Roman" w:eastAsia="宋体"/>
                 <w:b w:val="0"/>
-                <w:sz w:val="15"/>
-                <w:lang w:eastAsia="zh-CN"/>
+                <w:sz w:val="16"/>
               </w:rPr>
-              <w:t>10%</w:t>
+              <w:t>20%</w:t>
             </w:r>
           </w:p>
         </w:tc>
         <w:tc>
           <w:tcPr>
-            <w:tcW w:type="dxa" w:w="1250"/>
+            <w:tcW w:type="dxa" w:w="1100"/>
+            <w:vAlign w:val="center"/>
           </w:tcPr>
           <w:p>
             <w:pPr>
               <w:spacing w:before="0" w:after="0" w:line="240" w:lineRule="auto"/>
               <w:jc w:val="center"/>
             </w:pPr>
-            <w:r/>
             <w:r>
               <w:rPr>
-                <w:rFonts w:ascii="Times New Roman" w:hAnsi="Times New Roman" w:cs="Times New Roman" w:eastAsia="宋体" w:hint="eastAsia"/>
+                <w:rFonts w:ascii="Times New Roman" w:hAnsi="Times New Roman" w:eastAsia="宋体"/>
                 <w:b w:val="0"/>
-                <w:sz w:val="15"/>
-                <w:lang w:eastAsia="zh-CN"/>
+                <w:sz w:val="16"/>
               </w:rPr>
-              <w:t>5%</w:t>
+              <w:t>20%</w:t>
             </w:r>
           </w:p>
         </w:tc>
         <w:tc>
           <w:tcPr>
-            <w:tcW w:type="dxa" w:w="3004"/>
+            <w:tcW w:type="dxa" w:w="1250"/>
+            <w:vAlign w:val="center"/>
           </w:tcPr>
           <w:p>
             <w:pPr>
               <w:spacing w:before="0" w:after="0" w:line="240" w:lineRule="auto"/>
               <w:jc w:val="center"/>
             </w:pPr>
-            <w:r/>
             <w:r>
               <w:rPr>
-                <w:rFonts w:ascii="Times New Roman" w:hAnsi="Times New Roman" w:cs="Times New Roman" w:eastAsia="宋体" w:hint="eastAsia"/>
+                <w:rFonts w:ascii="Times New Roman" w:hAnsi="Times New Roman" w:eastAsia="宋体"/>
                 <w:b w:val="0"/>
-                <w:sz w:val="15"/>
-                <w:lang w:eastAsia="zh-CN"/>
+                <w:sz w:val="16"/>
+              </w:rPr>
+              <w:t>10%</w:t>
+            </w:r>
+          </w:p>
+        </w:tc>
+        <w:tc>
+          <w:tcPr>
+            <w:tcW w:type="dxa" w:w="3004"/>
+            <w:vAlign w:val="center"/>
+          </w:tcPr>
+          <w:p>
+            <w:pPr>
+              <w:spacing w:before="0" w:after="0" w:line="240" w:lineRule="auto"/>
+              <w:jc w:val="center"/>
+            </w:pPr>
+            <w:r>
+              <w:rPr>
+                <w:rFonts w:ascii="Times New Roman" w:hAnsi="Times New Roman" w:eastAsia="宋体"/>
+                <w:b w:val="0"/>
+                <w:sz w:val="16"/>
               </w:rPr>
               <w:t>目标 1.1，2.1，2.2，3.1，3.6</w:t>
             </w:r>
@@ -4774,61 +4761,38 @@
         <w:tc>
           <w:tcPr>
             <w:tcW w:type="dxa" w:w="1600"/>
-          </w:tcPr>
-          <w:p>
-            <w:pPr>
-              <w:spacing w:before="0" w:after="0" w:line="240" w:lineRule="auto"/>
-              <w:jc w:val="left"/>
-            </w:pPr>
-            <w:r/>
-            <w:r>
-              <w:rPr>
-                <w:rFonts w:ascii="Times New Roman" w:hAnsi="Times New Roman" w:cs="Times New Roman" w:eastAsia="宋体" w:hint="eastAsia"/>
-                <w:b/>
-                <w:sz w:val="15"/>
-                <w:lang w:eastAsia="zh-CN"/>
-              </w:rPr>
-              <w:t>第二单元 机械、材料与制造过程英语</w:t>
-            </w:r>
-          </w:p>
-        </w:tc>
-        <w:tc>
-          <w:tcPr>
-            <w:tcW w:type="dxa" w:w="650"/>
+            <w:vAlign w:val="center"/>
           </w:tcPr>
           <w:p>
             <w:pPr>
               <w:spacing w:before="0" w:after="0" w:line="240" w:lineRule="auto"/>
               <w:jc w:val="center"/>
             </w:pPr>
-            <w:r/>
             <w:r>
               <w:rPr>
-                <w:rFonts w:ascii="Times New Roman" w:hAnsi="Times New Roman" w:cs="Times New Roman" w:eastAsia="宋体" w:hint="eastAsia"/>
-                <w:b w:val="0"/>
-                <w:sz w:val="15"/>
-                <w:lang w:eastAsia="zh-CN"/>
+                <w:rFonts w:ascii="Times New Roman" w:hAnsi="Times New Roman" w:eastAsia="宋体"/>
+                <w:b/>
+                <w:sz w:val="16"/>
               </w:rPr>
-              <w:t>6</w:t>
+              <w:t>第二单元 机械、材料与制造过程英语</w:t>
             </w:r>
           </w:p>
         </w:tc>
         <w:tc>
           <w:tcPr>
             <w:tcW w:type="dxa" w:w="650"/>
+            <w:vAlign w:val="center"/>
           </w:tcPr>
           <w:p>
             <w:pPr>
               <w:spacing w:before="0" w:after="0" w:line="240" w:lineRule="auto"/>
               <w:jc w:val="center"/>
             </w:pPr>
-            <w:r/>
             <w:r>
               <w:rPr>
-                <w:rFonts w:ascii="Times New Roman" w:hAnsi="Times New Roman" w:cs="Times New Roman" w:eastAsia="宋体" w:hint="eastAsia"/>
+                <w:rFonts w:ascii="Times New Roman" w:hAnsi="Times New Roman" w:eastAsia="宋体"/>
                 <w:b w:val="0"/>
-                <w:sz w:val="15"/>
-                <w:lang w:eastAsia="zh-CN"/>
+                <w:sz w:val="16"/>
               </w:rPr>
               <w:t>6</w:t>
             </w:r>
@@ -4836,41 +4800,39 @@
         </w:tc>
         <w:tc>
           <w:tcPr>
-            <w:tcW w:type="dxa" w:w="1100"/>
+            <w:tcW w:type="dxa" w:w="650"/>
+            <w:vAlign w:val="center"/>
           </w:tcPr>
           <w:p>
             <w:pPr>
               <w:spacing w:before="0" w:after="0" w:line="240" w:lineRule="auto"/>
               <w:jc w:val="center"/>
             </w:pPr>
-            <w:r/>
             <w:r>
               <w:rPr>
-                <w:rFonts w:ascii="Times New Roman" w:hAnsi="Times New Roman" w:cs="Times New Roman" w:eastAsia="宋体" w:hint="eastAsia"/>
+                <w:rFonts w:ascii="Times New Roman" w:hAnsi="Times New Roman" w:eastAsia="宋体"/>
                 <w:b w:val="0"/>
-                <w:sz w:val="15"/>
-                <w:lang w:eastAsia="zh-CN"/>
+                <w:sz w:val="16"/>
               </w:rPr>
-              <w:t>20%</w:t>
+              <w:t>6</w:t>
             </w:r>
           </w:p>
         </w:tc>
         <w:tc>
           <w:tcPr>
             <w:tcW w:type="dxa" w:w="1100"/>
+            <w:vAlign w:val="center"/>
           </w:tcPr>
           <w:p>
             <w:pPr>
               <w:spacing w:before="0" w:after="0" w:line="240" w:lineRule="auto"/>
               <w:jc w:val="center"/>
             </w:pPr>
-            <w:r/>
             <w:r>
               <w:rPr>
-                <w:rFonts w:ascii="Times New Roman" w:hAnsi="Times New Roman" w:cs="Times New Roman" w:eastAsia="宋体" w:hint="eastAsia"/>
+                <w:rFonts w:ascii="Times New Roman" w:hAnsi="Times New Roman" w:eastAsia="宋体"/>
                 <w:b w:val="0"/>
-                <w:sz w:val="15"/>
-                <w:lang w:eastAsia="zh-CN"/>
+                <w:sz w:val="16"/>
               </w:rPr>
               <w:t>15%</w:t>
             </w:r>
@@ -4878,41 +4840,59 @@
         </w:tc>
         <w:tc>
           <w:tcPr>
-            <w:tcW w:type="dxa" w:w="1250"/>
+            <w:tcW w:type="dxa" w:w="1100"/>
+            <w:vAlign w:val="center"/>
           </w:tcPr>
           <w:p>
             <w:pPr>
               <w:spacing w:before="0" w:after="0" w:line="240" w:lineRule="auto"/>
               <w:jc w:val="center"/>
             </w:pPr>
-            <w:r/>
             <w:r>
               <w:rPr>
-                <w:rFonts w:ascii="Times New Roman" w:hAnsi="Times New Roman" w:cs="Times New Roman" w:eastAsia="宋体" w:hint="eastAsia"/>
+                <w:rFonts w:ascii="Times New Roman" w:hAnsi="Times New Roman" w:eastAsia="宋体"/>
                 <w:b w:val="0"/>
-                <w:sz w:val="15"/>
-                <w:lang w:eastAsia="zh-CN"/>
+                <w:sz w:val="16"/>
               </w:rPr>
-              <w:t>10%</w:t>
+              <w:t>15%</w:t>
             </w:r>
           </w:p>
         </w:tc>
         <w:tc>
           <w:tcPr>
-            <w:tcW w:type="dxa" w:w="3004"/>
+            <w:tcW w:type="dxa" w:w="1250"/>
+            <w:vAlign w:val="center"/>
           </w:tcPr>
           <w:p>
             <w:pPr>
               <w:spacing w:before="0" w:after="0" w:line="240" w:lineRule="auto"/>
               <w:jc w:val="center"/>
             </w:pPr>
-            <w:r/>
             <w:r>
               <w:rPr>
-                <w:rFonts w:ascii="Times New Roman" w:hAnsi="Times New Roman" w:cs="Times New Roman" w:eastAsia="宋体" w:hint="eastAsia"/>
+                <w:rFonts w:ascii="Times New Roman" w:hAnsi="Times New Roman" w:eastAsia="宋体"/>
                 <w:b w:val="0"/>
-                <w:sz w:val="15"/>
-                <w:lang w:eastAsia="zh-CN"/>
+                <w:sz w:val="16"/>
+              </w:rPr>
+              <w:t>10%</w:t>
+            </w:r>
+          </w:p>
+        </w:tc>
+        <w:tc>
+          <w:tcPr>
+            <w:tcW w:type="dxa" w:w="3004"/>
+            <w:vAlign w:val="center"/>
+          </w:tcPr>
+          <w:p>
+            <w:pPr>
+              <w:spacing w:before="0" w:after="0" w:line="240" w:lineRule="auto"/>
+              <w:jc w:val="center"/>
+            </w:pPr>
+            <w:r>
+              <w:rPr>
+                <w:rFonts w:ascii="Times New Roman" w:hAnsi="Times New Roman" w:eastAsia="宋体"/>
+                <w:b w:val="0"/>
+                <w:sz w:val="16"/>
               </w:rPr>
               <w:t>目标 1.2，2.2，2.3，3.1，3.2</w:t>
             </w:r>
@@ -4926,61 +4906,38 @@
         <w:tc>
           <w:tcPr>
             <w:tcW w:type="dxa" w:w="1600"/>
-          </w:tcPr>
-          <w:p>
-            <w:pPr>
-              <w:spacing w:before="0" w:after="0" w:line="240" w:lineRule="auto"/>
-              <w:jc w:val="left"/>
-            </w:pPr>
-            <w:r/>
-            <w:r>
-              <w:rPr>
-                <w:rFonts w:ascii="Times New Roman" w:hAnsi="Times New Roman" w:cs="Times New Roman" w:eastAsia="宋体" w:hint="eastAsia"/>
-                <w:b/>
-                <w:sz w:val="15"/>
-                <w:lang w:eastAsia="zh-CN"/>
-              </w:rPr>
-              <w:t>第三单元 智能装备与先进制造英语</w:t>
-            </w:r>
-          </w:p>
-        </w:tc>
-        <w:tc>
-          <w:tcPr>
-            <w:tcW w:type="dxa" w:w="650"/>
+            <w:vAlign w:val="center"/>
           </w:tcPr>
           <w:p>
             <w:pPr>
               <w:spacing w:before="0" w:after="0" w:line="240" w:lineRule="auto"/>
               <w:jc w:val="center"/>
             </w:pPr>
-            <w:r/>
             <w:r>
               <w:rPr>
-                <w:rFonts w:ascii="Times New Roman" w:hAnsi="Times New Roman" w:cs="Times New Roman" w:eastAsia="宋体" w:hint="eastAsia"/>
-                <w:b w:val="0"/>
-                <w:sz w:val="15"/>
-                <w:lang w:eastAsia="zh-CN"/>
+                <w:rFonts w:ascii="Times New Roman" w:hAnsi="Times New Roman" w:eastAsia="宋体"/>
+                <w:b/>
+                <w:sz w:val="16"/>
               </w:rPr>
-              <w:t>6</w:t>
+              <w:t>第三单元 智能装备与先进制造英语</w:t>
             </w:r>
           </w:p>
         </w:tc>
         <w:tc>
           <w:tcPr>
             <w:tcW w:type="dxa" w:w="650"/>
+            <w:vAlign w:val="center"/>
           </w:tcPr>
           <w:p>
             <w:pPr>
               <w:spacing w:before="0" w:after="0" w:line="240" w:lineRule="auto"/>
               <w:jc w:val="center"/>
             </w:pPr>
-            <w:r/>
             <w:r>
               <w:rPr>
-                <w:rFonts w:ascii="Times New Roman" w:hAnsi="Times New Roman" w:cs="Times New Roman" w:eastAsia="宋体" w:hint="eastAsia"/>
+                <w:rFonts w:ascii="Times New Roman" w:hAnsi="Times New Roman" w:eastAsia="宋体"/>
                 <w:b w:val="0"/>
-                <w:sz w:val="15"/>
-                <w:lang w:eastAsia="zh-CN"/>
+                <w:sz w:val="16"/>
               </w:rPr>
               <w:t>6</w:t>
             </w:r>
@@ -4988,41 +4945,39 @@
         </w:tc>
         <w:tc>
           <w:tcPr>
-            <w:tcW w:type="dxa" w:w="1100"/>
+            <w:tcW w:type="dxa" w:w="650"/>
+            <w:vAlign w:val="center"/>
           </w:tcPr>
           <w:p>
             <w:pPr>
               <w:spacing w:before="0" w:after="0" w:line="240" w:lineRule="auto"/>
               <w:jc w:val="center"/>
             </w:pPr>
-            <w:r/>
             <w:r>
               <w:rPr>
-                <w:rFonts w:ascii="Times New Roman" w:hAnsi="Times New Roman" w:cs="Times New Roman" w:eastAsia="宋体" w:hint="eastAsia"/>
+                <w:rFonts w:ascii="Times New Roman" w:hAnsi="Times New Roman" w:eastAsia="宋体"/>
                 <w:b w:val="0"/>
-                <w:sz w:val="15"/>
-                <w:lang w:eastAsia="zh-CN"/>
+                <w:sz w:val="16"/>
               </w:rPr>
-              <w:t>20%</w:t>
+              <w:t>6</w:t>
             </w:r>
           </w:p>
         </w:tc>
         <w:tc>
           <w:tcPr>
             <w:tcW w:type="dxa" w:w="1100"/>
+            <w:vAlign w:val="center"/>
           </w:tcPr>
           <w:p>
             <w:pPr>
               <w:spacing w:before="0" w:after="0" w:line="240" w:lineRule="auto"/>
               <w:jc w:val="center"/>
             </w:pPr>
-            <w:r/>
             <w:r>
               <w:rPr>
-                <w:rFonts w:ascii="Times New Roman" w:hAnsi="Times New Roman" w:cs="Times New Roman" w:eastAsia="宋体" w:hint="eastAsia"/>
+                <w:rFonts w:ascii="Times New Roman" w:hAnsi="Times New Roman" w:eastAsia="宋体"/>
                 <w:b w:val="0"/>
-                <w:sz w:val="15"/>
-                <w:lang w:eastAsia="zh-CN"/>
+                <w:sz w:val="16"/>
               </w:rPr>
               <w:t>15%</w:t>
             </w:r>
@@ -5030,20 +4985,19 @@
         </w:tc>
         <w:tc>
           <w:tcPr>
-            <w:tcW w:type="dxa" w:w="1250"/>
+            <w:tcW w:type="dxa" w:w="1100"/>
+            <w:vAlign w:val="center"/>
           </w:tcPr>
           <w:p>
             <w:pPr>
               <w:spacing w:before="0" w:after="0" w:line="240" w:lineRule="auto"/>
               <w:jc w:val="center"/>
             </w:pPr>
-            <w:r/>
             <w:r>
               <w:rPr>
-                <w:rFonts w:ascii="Times New Roman" w:hAnsi="Times New Roman" w:cs="Times New Roman" w:eastAsia="宋体" w:hint="eastAsia"/>
+                <w:rFonts w:ascii="Times New Roman" w:hAnsi="Times New Roman" w:eastAsia="宋体"/>
                 <w:b w:val="0"/>
-                <w:sz w:val="15"/>
-                <w:lang w:eastAsia="zh-CN"/>
+                <w:sz w:val="16"/>
               </w:rPr>
               <w:t>15%</w:t>
             </w:r>
@@ -5051,20 +5005,39 @@
         </w:tc>
         <w:tc>
           <w:tcPr>
-            <w:tcW w:type="dxa" w:w="3004"/>
+            <w:tcW w:type="dxa" w:w="1250"/>
+            <w:vAlign w:val="center"/>
           </w:tcPr>
           <w:p>
             <w:pPr>
               <w:spacing w:before="0" w:after="0" w:line="240" w:lineRule="auto"/>
               <w:jc w:val="center"/>
             </w:pPr>
-            <w:r/>
             <w:r>
               <w:rPr>
-                <w:rFonts w:ascii="Times New Roman" w:hAnsi="Times New Roman" w:cs="Times New Roman" w:eastAsia="宋体" w:hint="eastAsia"/>
+                <w:rFonts w:ascii="Times New Roman" w:hAnsi="Times New Roman" w:eastAsia="宋体"/>
                 <w:b w:val="0"/>
-                <w:sz w:val="15"/>
-                <w:lang w:eastAsia="zh-CN"/>
+                <w:sz w:val="16"/>
+              </w:rPr>
+              <w:t>15%</w:t>
+            </w:r>
+          </w:p>
+        </w:tc>
+        <w:tc>
+          <w:tcPr>
+            <w:tcW w:type="dxa" w:w="3004"/>
+            <w:vAlign w:val="center"/>
+          </w:tcPr>
+          <w:p>
+            <w:pPr>
+              <w:spacing w:before="0" w:after="0" w:line="240" w:lineRule="auto"/>
+              <w:jc w:val="center"/>
+            </w:pPr>
+            <w:r>
+              <w:rPr>
+                <w:rFonts w:ascii="Times New Roman" w:hAnsi="Times New Roman" w:eastAsia="宋体"/>
+                <w:b w:val="0"/>
+                <w:sz w:val="16"/>
               </w:rPr>
               <w:t>目标 1.2，1.3，2.3，2.5，3.2，3.5</w:t>
             </w:r>
@@ -5078,61 +5051,38 @@
         <w:tc>
           <w:tcPr>
             <w:tcW w:type="dxa" w:w="1600"/>
-          </w:tcPr>
-          <w:p>
-            <w:pPr>
-              <w:spacing w:before="0" w:after="0" w:line="240" w:lineRule="auto"/>
-              <w:jc w:val="left"/>
-            </w:pPr>
-            <w:r/>
-            <w:r>
-              <w:rPr>
-                <w:rFonts w:ascii="Times New Roman" w:hAnsi="Times New Roman" w:cs="Times New Roman" w:eastAsia="宋体" w:hint="eastAsia"/>
-                <w:b/>
-                <w:sz w:val="15"/>
-                <w:lang w:eastAsia="zh-CN"/>
-              </w:rPr>
-              <w:t>第四单元 工业互联与智能工厂英语</w:t>
-            </w:r>
-          </w:p>
-        </w:tc>
-        <w:tc>
-          <w:tcPr>
-            <w:tcW w:type="dxa" w:w="650"/>
+            <w:vAlign w:val="center"/>
           </w:tcPr>
           <w:p>
             <w:pPr>
               <w:spacing w:before="0" w:after="0" w:line="240" w:lineRule="auto"/>
               <w:jc w:val="center"/>
             </w:pPr>
-            <w:r/>
             <w:r>
               <w:rPr>
-                <w:rFonts w:ascii="Times New Roman" w:hAnsi="Times New Roman" w:cs="Times New Roman" w:eastAsia="宋体" w:hint="eastAsia"/>
-                <w:b w:val="0"/>
-                <w:sz w:val="15"/>
-                <w:lang w:eastAsia="zh-CN"/>
+                <w:rFonts w:ascii="Times New Roman" w:hAnsi="Times New Roman" w:eastAsia="宋体"/>
+                <w:b/>
+                <w:sz w:val="16"/>
               </w:rPr>
-              <w:t>6</w:t>
+              <w:t>第四单元 工业互联与智能工厂英语</w:t>
             </w:r>
           </w:p>
         </w:tc>
         <w:tc>
           <w:tcPr>
             <w:tcW w:type="dxa" w:w="650"/>
+            <w:vAlign w:val="center"/>
           </w:tcPr>
           <w:p>
             <w:pPr>
               <w:spacing w:before="0" w:after="0" w:line="240" w:lineRule="auto"/>
               <w:jc w:val="center"/>
             </w:pPr>
-            <w:r/>
             <w:r>
               <w:rPr>
-                <w:rFonts w:ascii="Times New Roman" w:hAnsi="Times New Roman" w:cs="Times New Roman" w:eastAsia="宋体" w:hint="eastAsia"/>
+                <w:rFonts w:ascii="Times New Roman" w:hAnsi="Times New Roman" w:eastAsia="宋体"/>
                 <w:b w:val="0"/>
-                <w:sz w:val="15"/>
-                <w:lang w:eastAsia="zh-CN"/>
+                <w:sz w:val="16"/>
               </w:rPr>
               <w:t>6</w:t>
             </w:r>
@@ -5140,41 +5090,39 @@
         </w:tc>
         <w:tc>
           <w:tcPr>
-            <w:tcW w:type="dxa" w:w="1100"/>
+            <w:tcW w:type="dxa" w:w="650"/>
+            <w:vAlign w:val="center"/>
           </w:tcPr>
           <w:p>
             <w:pPr>
               <w:spacing w:before="0" w:after="0" w:line="240" w:lineRule="auto"/>
               <w:jc w:val="center"/>
             </w:pPr>
-            <w:r/>
             <w:r>
               <w:rPr>
-                <w:rFonts w:ascii="Times New Roman" w:hAnsi="Times New Roman" w:cs="Times New Roman" w:eastAsia="宋体" w:hint="eastAsia"/>
+                <w:rFonts w:ascii="Times New Roman" w:hAnsi="Times New Roman" w:eastAsia="宋体"/>
                 <w:b w:val="0"/>
-                <w:sz w:val="15"/>
-                <w:lang w:eastAsia="zh-CN"/>
+                <w:sz w:val="16"/>
               </w:rPr>
-              <w:t>15%</w:t>
+              <w:t>6</w:t>
             </w:r>
           </w:p>
         </w:tc>
         <w:tc>
           <w:tcPr>
             <w:tcW w:type="dxa" w:w="1100"/>
+            <w:vAlign w:val="center"/>
           </w:tcPr>
           <w:p>
             <w:pPr>
               <w:spacing w:before="0" w:after="0" w:line="240" w:lineRule="auto"/>
               <w:jc w:val="center"/>
             </w:pPr>
-            <w:r/>
             <w:r>
               <w:rPr>
-                <w:rFonts w:ascii="Times New Roman" w:hAnsi="Times New Roman" w:cs="Times New Roman" w:eastAsia="宋体" w:hint="eastAsia"/>
+                <w:rFonts w:ascii="Times New Roman" w:hAnsi="Times New Roman" w:eastAsia="宋体"/>
                 <w:b w:val="0"/>
-                <w:sz w:val="15"/>
-                <w:lang w:eastAsia="zh-CN"/>
+                <w:sz w:val="16"/>
               </w:rPr>
               <w:t>15%</w:t>
             </w:r>
@@ -5182,41 +5130,59 @@
         </w:tc>
         <w:tc>
           <w:tcPr>
-            <w:tcW w:type="dxa" w:w="1250"/>
+            <w:tcW w:type="dxa" w:w="1100"/>
+            <w:vAlign w:val="center"/>
           </w:tcPr>
           <w:p>
             <w:pPr>
               <w:spacing w:before="0" w:after="0" w:line="240" w:lineRule="auto"/>
               <w:jc w:val="center"/>
             </w:pPr>
-            <w:r/>
             <w:r>
               <w:rPr>
-                <w:rFonts w:ascii="Times New Roman" w:hAnsi="Times New Roman" w:cs="Times New Roman" w:eastAsia="宋体" w:hint="eastAsia"/>
+                <w:rFonts w:ascii="Times New Roman" w:hAnsi="Times New Roman" w:eastAsia="宋体"/>
                 <w:b w:val="0"/>
-                <w:sz w:val="15"/>
-                <w:lang w:eastAsia="zh-CN"/>
+                <w:sz w:val="16"/>
               </w:rPr>
-              <w:t>20%</w:t>
+              <w:t>15%</w:t>
             </w:r>
           </w:p>
         </w:tc>
         <w:tc>
           <w:tcPr>
-            <w:tcW w:type="dxa" w:w="3004"/>
+            <w:tcW w:type="dxa" w:w="1250"/>
+            <w:vAlign w:val="center"/>
           </w:tcPr>
           <w:p>
             <w:pPr>
               <w:spacing w:before="0" w:after="0" w:line="240" w:lineRule="auto"/>
               <w:jc w:val="center"/>
             </w:pPr>
-            <w:r/>
             <w:r>
               <w:rPr>
-                <w:rFonts w:ascii="Times New Roman" w:hAnsi="Times New Roman" w:cs="Times New Roman" w:eastAsia="宋体" w:hint="eastAsia"/>
+                <w:rFonts w:ascii="Times New Roman" w:hAnsi="Times New Roman" w:eastAsia="宋体"/>
                 <w:b w:val="0"/>
-                <w:sz w:val="15"/>
-                <w:lang w:eastAsia="zh-CN"/>
+                <w:sz w:val="16"/>
+              </w:rPr>
+              <w:t>15%</w:t>
+            </w:r>
+          </w:p>
+        </w:tc>
+        <w:tc>
+          <w:tcPr>
+            <w:tcW w:type="dxa" w:w="3004"/>
+            <w:vAlign w:val="center"/>
+          </w:tcPr>
+          <w:p>
+            <w:pPr>
+              <w:spacing w:before="0" w:after="0" w:line="240" w:lineRule="auto"/>
+              <w:jc w:val="center"/>
+            </w:pPr>
+            <w:r>
+              <w:rPr>
+                <w:rFonts w:ascii="Times New Roman" w:hAnsi="Times New Roman" w:eastAsia="宋体"/>
+                <w:b w:val="0"/>
+                <w:sz w:val="16"/>
               </w:rPr>
               <w:t>目标 1.3，2.3，2.5，3.2，3.5</w:t>
             </w:r>
@@ -5230,61 +5196,38 @@
         <w:tc>
           <w:tcPr>
             <w:tcW w:type="dxa" w:w="1600"/>
-          </w:tcPr>
-          <w:p>
-            <w:pPr>
-              <w:spacing w:before="0" w:after="0" w:line="240" w:lineRule="auto"/>
-              <w:jc w:val="left"/>
-            </w:pPr>
-            <w:r/>
-            <w:r>
-              <w:rPr>
-                <w:rFonts w:ascii="Times New Roman" w:hAnsi="Times New Roman" w:cs="Times New Roman" w:eastAsia="宋体" w:hint="eastAsia"/>
-                <w:b/>
-                <w:sz w:val="15"/>
-                <w:lang w:eastAsia="zh-CN"/>
-              </w:rPr>
-              <w:t>第五单元 手册、标准与排故英语</w:t>
-            </w:r>
-          </w:p>
-        </w:tc>
-        <w:tc>
-          <w:tcPr>
-            <w:tcW w:type="dxa" w:w="650"/>
+            <w:vAlign w:val="center"/>
           </w:tcPr>
           <w:p>
             <w:pPr>
               <w:spacing w:before="0" w:after="0" w:line="240" w:lineRule="auto"/>
               <w:jc w:val="center"/>
             </w:pPr>
-            <w:r/>
             <w:r>
               <w:rPr>
-                <w:rFonts w:ascii="Times New Roman" w:hAnsi="Times New Roman" w:cs="Times New Roman" w:eastAsia="宋体" w:hint="eastAsia"/>
-                <w:b w:val="0"/>
-                <w:sz w:val="15"/>
-                <w:lang w:eastAsia="zh-CN"/>
+                <w:rFonts w:ascii="Times New Roman" w:hAnsi="Times New Roman" w:eastAsia="宋体"/>
+                <w:b/>
+                <w:sz w:val="16"/>
               </w:rPr>
-              <w:t>5</w:t>
+              <w:t>第五单元 手册、标准与排故英语</w:t>
             </w:r>
           </w:p>
         </w:tc>
         <w:tc>
           <w:tcPr>
             <w:tcW w:type="dxa" w:w="650"/>
+            <w:vAlign w:val="center"/>
           </w:tcPr>
           <w:p>
             <w:pPr>
               <w:spacing w:before="0" w:after="0" w:line="240" w:lineRule="auto"/>
               <w:jc w:val="center"/>
             </w:pPr>
-            <w:r/>
             <w:r>
               <w:rPr>
-                <w:rFonts w:ascii="Times New Roman" w:hAnsi="Times New Roman" w:cs="Times New Roman" w:eastAsia="宋体" w:hint="eastAsia"/>
+                <w:rFonts w:ascii="Times New Roman" w:hAnsi="Times New Roman" w:eastAsia="宋体"/>
                 <w:b w:val="0"/>
-                <w:sz w:val="15"/>
-                <w:lang w:eastAsia="zh-CN"/>
+                <w:sz w:val="16"/>
               </w:rPr>
               <w:t>5</w:t>
             </w:r>
@@ -5292,62 +5235,59 @@
         </w:tc>
         <w:tc>
           <w:tcPr>
-            <w:tcW w:type="dxa" w:w="1100"/>
+            <w:tcW w:type="dxa" w:w="650"/>
+            <w:vAlign w:val="center"/>
           </w:tcPr>
           <w:p>
             <w:pPr>
               <w:spacing w:before="0" w:after="0" w:line="240" w:lineRule="auto"/>
               <w:jc w:val="center"/>
             </w:pPr>
-            <w:r/>
             <w:r>
               <w:rPr>
-                <w:rFonts w:ascii="Times New Roman" w:hAnsi="Times New Roman" w:cs="Times New Roman" w:eastAsia="宋体" w:hint="eastAsia"/>
+                <w:rFonts w:ascii="Times New Roman" w:hAnsi="Times New Roman" w:eastAsia="宋体"/>
                 <w:b w:val="0"/>
-                <w:sz w:val="15"/>
-                <w:lang w:eastAsia="zh-CN"/>
+                <w:sz w:val="16"/>
               </w:rPr>
-              <w:t>15%</w:t>
+              <w:t>5</w:t>
             </w:r>
           </w:p>
         </w:tc>
         <w:tc>
           <w:tcPr>
             <w:tcW w:type="dxa" w:w="1100"/>
+            <w:vAlign w:val="center"/>
           </w:tcPr>
           <w:p>
             <w:pPr>
               <w:spacing w:before="0" w:after="0" w:line="240" w:lineRule="auto"/>
               <w:jc w:val="center"/>
             </w:pPr>
-            <w:r/>
             <w:r>
               <w:rPr>
-                <w:rFonts w:ascii="Times New Roman" w:hAnsi="Times New Roman" w:cs="Times New Roman" w:eastAsia="宋体" w:hint="eastAsia"/>
+                <w:rFonts w:ascii="Times New Roman" w:hAnsi="Times New Roman" w:eastAsia="宋体"/>
                 <w:b w:val="0"/>
-                <w:sz w:val="15"/>
-                <w:lang w:eastAsia="zh-CN"/>
+                <w:sz w:val="16"/>
               </w:rPr>
-              <w:t>20%</w:t>
+              <w:t>15%</w:t>
             </w:r>
           </w:p>
         </w:tc>
         <w:tc>
           <w:tcPr>
-            <w:tcW w:type="dxa" w:w="1250"/>
+            <w:tcW w:type="dxa" w:w="1100"/>
+            <w:vAlign w:val="center"/>
           </w:tcPr>
           <w:p>
             <w:pPr>
               <w:spacing w:before="0" w:after="0" w:line="240" w:lineRule="auto"/>
               <w:jc w:val="center"/>
             </w:pPr>
-            <w:r/>
             <w:r>
               <w:rPr>
-                <w:rFonts w:ascii="Times New Roman" w:hAnsi="Times New Roman" w:cs="Times New Roman" w:eastAsia="宋体" w:hint="eastAsia"/>
+                <w:rFonts w:ascii="Times New Roman" w:hAnsi="Times New Roman" w:eastAsia="宋体"/>
                 <w:b w:val="0"/>
-                <w:sz w:val="15"/>
-                <w:lang w:eastAsia="zh-CN"/>
+                <w:sz w:val="16"/>
               </w:rPr>
               <w:t>20%</w:t>
             </w:r>
@@ -5355,20 +5295,39 @@
         </w:tc>
         <w:tc>
           <w:tcPr>
-            <w:tcW w:type="dxa" w:w="3004"/>
+            <w:tcW w:type="dxa" w:w="1250"/>
+            <w:vAlign w:val="center"/>
           </w:tcPr>
           <w:p>
             <w:pPr>
               <w:spacing w:before="0" w:after="0" w:line="240" w:lineRule="auto"/>
               <w:jc w:val="center"/>
             </w:pPr>
-            <w:r/>
             <w:r>
               <w:rPr>
-                <w:rFonts w:ascii="Times New Roman" w:hAnsi="Times New Roman" w:cs="Times New Roman" w:eastAsia="宋体" w:hint="eastAsia"/>
+                <w:rFonts w:ascii="Times New Roman" w:hAnsi="Times New Roman" w:eastAsia="宋体"/>
                 <w:b w:val="0"/>
-                <w:sz w:val="15"/>
-                <w:lang w:eastAsia="zh-CN"/>
+                <w:sz w:val="16"/>
+              </w:rPr>
+              <w:t>20%</w:t>
+            </w:r>
+          </w:p>
+        </w:tc>
+        <w:tc>
+          <w:tcPr>
+            <w:tcW w:type="dxa" w:w="3004"/>
+            <w:vAlign w:val="center"/>
+          </w:tcPr>
+          <w:p>
+            <w:pPr>
+              <w:spacing w:before="0" w:after="0" w:line="240" w:lineRule="auto"/>
+              <w:jc w:val="center"/>
+            </w:pPr>
+            <w:r>
+              <w:rPr>
+                <w:rFonts w:ascii="Times New Roman" w:hAnsi="Times New Roman" w:eastAsia="宋体"/>
+                <w:b w:val="0"/>
+                <w:sz w:val="16"/>
               </w:rPr>
               <w:t>目标 1.4，1.5，2.4，3.1，3.3，3.4</w:t>
             </w:r>
@@ -5382,61 +5341,38 @@
         <w:tc>
           <w:tcPr>
             <w:tcW w:type="dxa" w:w="1600"/>
-          </w:tcPr>
-          <w:p>
-            <w:pPr>
-              <w:spacing w:before="0" w:after="0" w:line="240" w:lineRule="auto"/>
-              <w:jc w:val="left"/>
-            </w:pPr>
-            <w:r/>
-            <w:r>
-              <w:rPr>
-                <w:rFonts w:ascii="Times New Roman" w:hAnsi="Times New Roman" w:cs="Times New Roman" w:eastAsia="宋体" w:hint="eastAsia"/>
-                <w:b/>
-                <w:sz w:val="15"/>
-                <w:lang w:eastAsia="zh-CN"/>
-              </w:rPr>
-              <w:t>第六单元 文献、写作与国际汇报</w:t>
-            </w:r>
-          </w:p>
-        </w:tc>
-        <w:tc>
-          <w:tcPr>
-            <w:tcW w:type="dxa" w:w="650"/>
+            <w:vAlign w:val="center"/>
           </w:tcPr>
           <w:p>
             <w:pPr>
               <w:spacing w:before="0" w:after="0" w:line="240" w:lineRule="auto"/>
               <w:jc w:val="center"/>
             </w:pPr>
-            <w:r/>
             <w:r>
               <w:rPr>
-                <w:rFonts w:ascii="Times New Roman" w:hAnsi="Times New Roman" w:cs="Times New Roman" w:eastAsia="宋体" w:hint="eastAsia"/>
-                <w:b w:val="0"/>
-                <w:sz w:val="15"/>
-                <w:lang w:eastAsia="zh-CN"/>
+                <w:rFonts w:ascii="Times New Roman" w:hAnsi="Times New Roman" w:eastAsia="宋体"/>
+                <w:b/>
+                <w:sz w:val="16"/>
               </w:rPr>
-              <w:t>5</w:t>
+              <w:t>第六单元 文献、写作与国际汇报</w:t>
             </w:r>
           </w:p>
         </w:tc>
         <w:tc>
           <w:tcPr>
             <w:tcW w:type="dxa" w:w="650"/>
+            <w:vAlign w:val="center"/>
           </w:tcPr>
           <w:p>
             <w:pPr>
               <w:spacing w:before="0" w:after="0" w:line="240" w:lineRule="auto"/>
               <w:jc w:val="center"/>
             </w:pPr>
-            <w:r/>
             <w:r>
               <w:rPr>
-                <w:rFonts w:ascii="Times New Roman" w:hAnsi="Times New Roman" w:cs="Times New Roman" w:eastAsia="宋体" w:hint="eastAsia"/>
+                <w:rFonts w:ascii="Times New Roman" w:hAnsi="Times New Roman" w:eastAsia="宋体"/>
                 <w:b w:val="0"/>
-                <w:sz w:val="15"/>
-                <w:lang w:eastAsia="zh-CN"/>
+                <w:sz w:val="16"/>
               </w:rPr>
               <w:t>5</w:t>
             </w:r>
@@ -5444,148 +5380,141 @@
         </w:tc>
         <w:tc>
           <w:tcPr>
-            <w:tcW w:type="dxa" w:w="1100"/>
+            <w:tcW w:type="dxa" w:w="650"/>
+            <w:vAlign w:val="center"/>
           </w:tcPr>
           <w:p>
             <w:pPr>
               <w:spacing w:before="0" w:after="0" w:line="240" w:lineRule="auto"/>
               <w:jc w:val="center"/>
             </w:pPr>
-            <w:r/>
             <w:r>
               <w:rPr>
-                <w:rFonts w:ascii="Times New Roman" w:hAnsi="Times New Roman" w:cs="Times New Roman" w:eastAsia="宋体" w:hint="eastAsia"/>
+                <w:rFonts w:ascii="Times New Roman" w:hAnsi="Times New Roman" w:eastAsia="宋体"/>
                 <w:b w:val="0"/>
-                <w:sz w:val="15"/>
-                <w:lang w:eastAsia="zh-CN"/>
+                <w:sz w:val="16"/>
               </w:rPr>
-              <w:t>10%</w:t>
+              <w:t>5</w:t>
             </w:r>
           </w:p>
         </w:tc>
         <w:tc>
           <w:tcPr>
             <w:tcW w:type="dxa" w:w="1100"/>
+            <w:vAlign w:val="center"/>
           </w:tcPr>
           <w:p>
             <w:pPr>
               <w:spacing w:before="0" w:after="0" w:line="240" w:lineRule="auto"/>
               <w:jc w:val="center"/>
             </w:pPr>
-            <w:r/>
             <w:r>
               <w:rPr>
-                <w:rFonts w:ascii="Times New Roman" w:hAnsi="Times New Roman" w:cs="Times New Roman" w:eastAsia="宋体" w:hint="eastAsia"/>
+                <w:rFonts w:ascii="Times New Roman" w:hAnsi="Times New Roman" w:eastAsia="宋体"/>
                 <w:b w:val="0"/>
-                <w:sz w:val="15"/>
-                <w:lang w:eastAsia="zh-CN"/>
+                <w:sz w:val="16"/>
               </w:rPr>
-              <w:t>25%</w:t>
+              <w:t>20%</w:t>
             </w:r>
           </w:p>
         </w:tc>
         <w:tc>
           <w:tcPr>
-            <w:tcW w:type="dxa" w:w="1250"/>
+            <w:tcW w:type="dxa" w:w="1100"/>
+            <w:vAlign w:val="center"/>
           </w:tcPr>
           <w:p>
             <w:pPr>
               <w:spacing w:before="0" w:after="0" w:line="240" w:lineRule="auto"/>
               <w:jc w:val="center"/>
             </w:pPr>
-            <w:r/>
             <w:r>
               <w:rPr>
-                <w:rFonts w:ascii="Times New Roman" w:hAnsi="Times New Roman" w:cs="Times New Roman" w:eastAsia="宋体" w:hint="eastAsia"/>
+                <w:rFonts w:ascii="Times New Roman" w:hAnsi="Times New Roman" w:eastAsia="宋体"/>
                 <w:b w:val="0"/>
-                <w:sz w:val="15"/>
-                <w:lang w:eastAsia="zh-CN"/>
+                <w:sz w:val="16"/>
               </w:rPr>
-              <w:t>30%</w:t>
+              <w:t>15%</w:t>
             </w:r>
           </w:p>
         </w:tc>
         <w:tc>
           <w:tcPr>
-            <w:tcW w:type="dxa" w:w="3004"/>
+            <w:tcW w:type="dxa" w:w="1250"/>
+            <w:vAlign w:val="center"/>
           </w:tcPr>
           <w:p>
             <w:pPr>
               <w:spacing w:before="0" w:after="0" w:line="240" w:lineRule="auto"/>
               <w:jc w:val="center"/>
             </w:pPr>
-            <w:r/>
             <w:r>
               <w:rPr>
-                <w:rFonts w:ascii="Times New Roman" w:hAnsi="Times New Roman" w:cs="Times New Roman" w:eastAsia="宋体" w:hint="eastAsia"/>
+                <w:rFonts w:ascii="Times New Roman" w:hAnsi="Times New Roman" w:eastAsia="宋体"/>
                 <w:b w:val="0"/>
-                <w:sz w:val="15"/>
-                <w:lang w:eastAsia="zh-CN"/>
+                <w:sz w:val="16"/>
               </w:rPr>
-              <w:t>目标 1.5，1.6，2.5，2.6，3.4—3.6</w:t>
+              <w:t>30%</w:t>
             </w:r>
           </w:p>
         </w:tc>
-      </w:tr>
-      <w:tr>
-        <w:tc>
-          <w:tcPr>
-            <w:tcW w:type="dxa" w:w="1600"/>
+        <w:tc>
+          <w:tcPr>
+            <w:tcW w:type="dxa" w:w="3004"/>
+            <w:vAlign w:val="center"/>
           </w:tcPr>
           <w:p>
             <w:pPr>
               <w:spacing w:before="0" w:after="0" w:line="240" w:lineRule="auto"/>
               <w:jc w:val="center"/>
             </w:pPr>
-            <w:r/>
             <w:r>
               <w:rPr>
-                <w:rFonts w:ascii="Times New Roman" w:hAnsi="Times New Roman" w:cs="Times New Roman" w:eastAsia="宋体" w:hint="eastAsia"/>
-                <w:b/>
+                <w:rFonts w:ascii="Times New Roman" w:hAnsi="Times New Roman" w:eastAsia="宋体"/>
+                <w:b w:val="0"/>
                 <w:sz w:val="16"/>
-                <w:lang w:eastAsia="zh-CN"/>
               </w:rPr>
-              <w:t>合计</w:t>
+              <w:t>目标 1.5，1.6，2.5，2.6，3.4—3.6</w:t>
             </w:r>
           </w:p>
         </w:tc>
-        <w:tc>
-          <w:tcPr>
-            <w:tcW w:type="dxa" w:w="650"/>
+      </w:tr>
+      <w:tr>
+        <w:tc>
+          <w:tcPr>
+            <w:tcW w:type="dxa" w:w="1600"/>
+            <w:vAlign w:val="center"/>
           </w:tcPr>
           <w:p>
             <w:pPr>
               <w:spacing w:before="0" w:after="0" w:line="240" w:lineRule="auto"/>
               <w:jc w:val="center"/>
             </w:pPr>
-            <w:r/>
             <w:r>
               <w:rPr>
-                <w:rFonts w:ascii="Times New Roman" w:hAnsi="Times New Roman" w:cs="Times New Roman" w:eastAsia="宋体" w:hint="eastAsia"/>
+                <w:rFonts w:ascii="Times New Roman" w:hAnsi="Times New Roman" w:eastAsia="宋体"/>
                 <w:b/>
                 <w:sz w:val="16"/>
-                <w:lang w:eastAsia="zh-CN"/>
               </w:rPr>
-              <w:t>32</w:t>
+              <w:t>合计</w:t>
             </w:r>
           </w:p>
         </w:tc>
         <w:tc>
           <w:tcPr>
             <w:tcW w:type="dxa" w:w="650"/>
+            <w:vAlign w:val="center"/>
           </w:tcPr>
           <w:p>
             <w:pPr>
               <w:spacing w:before="0" w:after="0" w:line="240" w:lineRule="auto"/>
               <w:jc w:val="center"/>
             </w:pPr>
-            <w:r/>
             <w:r>
               <w:rPr>
-                <w:rFonts w:ascii="Times New Roman" w:hAnsi="Times New Roman" w:cs="Times New Roman" w:eastAsia="宋体" w:hint="eastAsia"/>
+                <w:rFonts w:ascii="Times New Roman" w:hAnsi="Times New Roman" w:eastAsia="宋体"/>
                 <w:b/>
                 <w:sz w:val="16"/>
-                <w:lang w:eastAsia="zh-CN"/>
               </w:rPr>
               <w:t>32</w:t>
             </w:r>
@@ -5593,41 +5522,39 @@
         </w:tc>
         <w:tc>
           <w:tcPr>
-            <w:tcW w:type="dxa" w:w="1100"/>
+            <w:tcW w:type="dxa" w:w="650"/>
+            <w:vAlign w:val="center"/>
           </w:tcPr>
           <w:p>
             <w:pPr>
               <w:spacing w:before="0" w:after="0" w:line="240" w:lineRule="auto"/>
               <w:jc w:val="center"/>
             </w:pPr>
-            <w:r/>
             <w:r>
               <w:rPr>
-                <w:rFonts w:ascii="Times New Roman" w:hAnsi="Times New Roman" w:cs="Times New Roman" w:eastAsia="宋体" w:hint="eastAsia"/>
+                <w:rFonts w:ascii="Times New Roman" w:hAnsi="Times New Roman" w:eastAsia="宋体"/>
                 <w:b/>
                 <w:sz w:val="16"/>
-                <w:lang w:eastAsia="zh-CN"/>
               </w:rPr>
-              <w:t>100%</w:t>
+              <w:t>32</w:t>
             </w:r>
           </w:p>
         </w:tc>
         <w:tc>
           <w:tcPr>
             <w:tcW w:type="dxa" w:w="1100"/>
+            <w:vAlign w:val="center"/>
           </w:tcPr>
           <w:p>
             <w:pPr>
               <w:spacing w:before="0" w:after="0" w:line="240" w:lineRule="auto"/>
               <w:jc w:val="center"/>
             </w:pPr>
-            <w:r/>
             <w:r>
               <w:rPr>
-                <w:rFonts w:ascii="Times New Roman" w:hAnsi="Times New Roman" w:cs="Times New Roman" w:eastAsia="宋体" w:hint="eastAsia"/>
+                <w:rFonts w:ascii="Times New Roman" w:hAnsi="Times New Roman" w:eastAsia="宋体"/>
                 <w:b/>
                 <w:sz w:val="16"/>
-                <w:lang w:eastAsia="zh-CN"/>
               </w:rPr>
               <w:t>100%</w:t>
             </w:r>
@@ -5635,20 +5562,19 @@
         </w:tc>
         <w:tc>
           <w:tcPr>
-            <w:tcW w:type="dxa" w:w="1250"/>
+            <w:tcW w:type="dxa" w:w="1100"/>
+            <w:vAlign w:val="center"/>
           </w:tcPr>
           <w:p>
             <w:pPr>
               <w:spacing w:before="0" w:after="0" w:line="240" w:lineRule="auto"/>
               <w:jc w:val="center"/>
             </w:pPr>
-            <w:r/>
             <w:r>
               <w:rPr>
-                <w:rFonts w:ascii="Times New Roman" w:hAnsi="Times New Roman" w:cs="Times New Roman" w:eastAsia="宋体" w:hint="eastAsia"/>
+                <w:rFonts w:ascii="Times New Roman" w:hAnsi="Times New Roman" w:eastAsia="宋体"/>
                 <w:b/>
                 <w:sz w:val="16"/>
-                <w:lang w:eastAsia="zh-CN"/>
               </w:rPr>
               <w:t>100%</w:t>
             </w:r>
@@ -5656,20 +5582,39 @@
         </w:tc>
         <w:tc>
           <w:tcPr>
-            <w:tcW w:type="dxa" w:w="3004"/>
+            <w:tcW w:type="dxa" w:w="1250"/>
+            <w:vAlign w:val="center"/>
           </w:tcPr>
           <w:p>
             <w:pPr>
               <w:spacing w:before="0" w:after="0" w:line="240" w:lineRule="auto"/>
               <w:jc w:val="center"/>
             </w:pPr>
-            <w:r/>
             <w:r>
               <w:rPr>
-                <w:rFonts w:ascii="Times New Roman" w:hAnsi="Times New Roman" w:cs="Times New Roman" w:eastAsia="宋体" w:hint="eastAsia"/>
+                <w:rFonts w:ascii="Times New Roman" w:hAnsi="Times New Roman" w:eastAsia="宋体"/>
                 <w:b/>
                 <w:sz w:val="16"/>
-                <w:lang w:eastAsia="zh-CN"/>
+              </w:rPr>
+              <w:t>100%</w:t>
+            </w:r>
+          </w:p>
+        </w:tc>
+        <w:tc>
+          <w:tcPr>
+            <w:tcW w:type="dxa" w:w="3004"/>
+            <w:vAlign w:val="center"/>
+          </w:tcPr>
+          <w:p>
+            <w:pPr>
+              <w:spacing w:before="0" w:after="0" w:line="240" w:lineRule="auto"/>
+              <w:jc w:val="center"/>
+            </w:pPr>
+            <w:r>
+              <w:rPr>
+                <w:rFonts w:ascii="Times New Roman" w:hAnsi="Times New Roman" w:eastAsia="宋体"/>
+                <w:b/>
+                <w:sz w:val="16"/>
               </w:rPr>
               <w:t>—</w:t>
             </w:r>
@@ -5679,16 +5624,15 @@
     </w:tbl>
     <w:p>
       <w:pPr>
-        <w:spacing w:before="0" w:after="0" w:line="293" w:lineRule="auto"/>
+        <w:spacing w:before="0" w:after="0" w:line="276" w:lineRule="auto"/>
       </w:pPr>
       <w:r>
         <w:rPr>
-          <w:rFonts w:ascii="Times New Roman" w:hAnsi="Times New Roman" w:cs="Times New Roman" w:eastAsia="宋体" w:hint="eastAsia"/>
+          <w:rFonts w:ascii="Times New Roman" w:hAnsi="Times New Roman" w:eastAsia="宋体"/>
           <w:b w:val="0"/>
-          <w:sz w:val="19"/>
-          <w:lang w:eastAsia="zh-CN"/>
+          <w:sz w:val="20"/>
         </w:rPr>
-        <w:t>平时表现占总评15%，不按教学单元分配内部比例，依据考勤、课堂参与、术语与阅读档案、同伴互评和工具使用规范综合评价。</w:t>
+        <w:t>平时成绩、课程作业和期末考核均按教学单元设置内部权重，各列内部权重分别合计100%。平时成绩主要依据课堂参与、学习过程、规范、记录和学术诚信等过程性表现评价。</w:t>
       </w:r>
     </w:p>
     <w:p>
@@ -5752,17 +5696,16 @@
     </w:p>
     <w:p>
       <w:pPr>
-        <w:spacing w:before="0" w:after="0" w:line="293" w:lineRule="auto"/>
+        <w:spacing w:before="0" w:after="0" w:line="283" w:lineRule="auto"/>
         <w:ind w:firstLine="420"/>
       </w:pPr>
       <w:r>
         <w:rPr>
-          <w:rFonts w:ascii="Times New Roman" w:hAnsi="Times New Roman" w:cs="Times New Roman" w:eastAsia="宋体" w:hint="eastAsia"/>
+          <w:rFonts w:ascii="Times New Roman" w:hAnsi="Times New Roman" w:eastAsia="宋体"/>
           <w:b w:val="0"/>
-          <w:sz w:val="21"/>
-          <w:lang w:eastAsia="zh-CN"/>
+          <w:sz w:val="20"/>
         </w:rPr>
-        <w:t>本课程采用平时表现、专业阅读与术语任务、翻译与技术写作任务和综合英文技术沟通项目相结合的方式。最终成绩100%=平时表现15%＋专业阅读与术语任务25%＋翻译与技术写作任务25%＋综合英文技术沟通项目35%。综合项目可2—3人组队，围绕数控装备、工业机器人、增材制造、数字孪生、智能产线或预测性维护等主题完成双语术语库、英文资料阅读证据、技术说明/翻译、图表或安全排故片段、英文/双语汇报与个人问答；团队成果须通过个人现场解释或修改核验个人能力。</w:t>
+        <w:t>本课程采用平时成绩、课程作业和期末考核相结合的方式。最终成绩100%=平时成绩20%＋课程作业20%＋期末考核60%。课程作业整合原有专业阅读、术语管理、技术翻译、技术写作、手册/标准分析和AI辅助后编辑等学习证据；期末考核采用综合英文技术沟通考查，不设置闭卷笔试或机考，围绕数控装备、工业机器人、增材制造、数字孪生、智能产线或预测性维护等主题形成综合成果，并通过英文或中英双语汇报、问答和个人核验检查学生对核心知识、核心能力和综合应用的掌握情况。</w:t>
       </w:r>
     </w:p>
     <w:p>
@@ -5783,16 +5726,15 @@
     <w:p>
       <w:pPr>
         <w:keepNext/>
-        <w:spacing w:before="80" w:after="40"/>
+        <w:spacing w:before="0" w:after="0" w:line="276" w:lineRule="auto"/>
       </w:pPr>
       <w:r>
         <w:rPr>
-          <w:rFonts w:ascii="Times New Roman" w:hAnsi="Times New Roman" w:cs="Times New Roman" w:eastAsia="宋体" w:hint="eastAsia"/>
+          <w:rFonts w:ascii="Times New Roman" w:hAnsi="Times New Roman" w:eastAsia="宋体"/>
           <w:b/>
           <w:sz w:val="24"/>
-          <w:lang w:eastAsia="zh-CN"/>
         </w:rPr>
-        <w:t>（1）平时表现评分标准</w:t>
+        <w:t>（1）平时成绩评分标准</w:t>
       </w:r>
     </w:p>
     <w:tbl>
@@ -6027,40 +5969,183 @@
         <w:tc>
           <w:tcPr>
             <w:tcW w:type="dxa" w:w="1250"/>
+            <w:vAlign w:val="center"/>
+          </w:tcPr>
+          <w:p>
+            <w:pPr>
+              <w:spacing w:before="0" w:after="0" w:line="240" w:lineRule="auto"/>
+              <w:jc w:val="left"/>
+            </w:pPr>
+            <w:r>
+              <w:rPr>
+                <w:rFonts w:ascii="Times New Roman" w:hAnsi="Times New Roman" w:eastAsia="宋体"/>
+                <w:b/>
+                <w:sz w:val="15"/>
+              </w:rPr>
+              <w:t>考勤与课堂规范</w:t>
+            </w:r>
+          </w:p>
+        </w:tc>
+        <w:tc>
+          <w:tcPr>
+            <w:tcW w:type="dxa" w:w="700"/>
+            <w:vAlign w:val="center"/>
           </w:tcPr>
           <w:p>
             <w:pPr>
               <w:spacing w:before="0" w:after="0" w:line="240" w:lineRule="auto"/>
               <w:jc w:val="center"/>
             </w:pPr>
-            <w:r/>
             <w:r>
               <w:rPr>
-                <w:rFonts w:ascii="Times New Roman" w:hAnsi="Times New Roman" w:cs="Times New Roman" w:eastAsia="宋体" w:hint="eastAsia"/>
+                <w:rFonts w:ascii="Times New Roman" w:hAnsi="Times New Roman" w:eastAsia="宋体"/>
+                <w:b w:val="0"/>
+                <w:sz w:val="15"/>
+              </w:rPr>
+              <w:t>25%</w:t>
+            </w:r>
+          </w:p>
+        </w:tc>
+        <w:tc>
+          <w:tcPr>
+            <w:tcW w:type="dxa" w:w="1460"/>
+            <w:vAlign w:val="center"/>
+          </w:tcPr>
+          <w:p>
+            <w:pPr>
+              <w:spacing w:before="0" w:after="0" w:line="240" w:lineRule="auto"/>
+              <w:jc w:val="left"/>
+            </w:pPr>
+            <w:r>
+              <w:rPr>
+                <w:rFonts w:ascii="Times New Roman" w:hAnsi="Times New Roman" w:eastAsia="宋体"/>
+                <w:b w:val="0"/>
+                <w:sz w:val="15"/>
+              </w:rPr>
+              <w:t>出勤完整，准备充分，严格遵守课堂、引用和工具使用规范</w:t>
+            </w:r>
+          </w:p>
+        </w:tc>
+        <w:tc>
+          <w:tcPr>
+            <w:tcW w:type="dxa" w:w="1460"/>
+            <w:vAlign w:val="center"/>
+          </w:tcPr>
+          <w:p>
+            <w:pPr>
+              <w:spacing w:before="0" w:after="0" w:line="240" w:lineRule="auto"/>
+              <w:jc w:val="left"/>
+            </w:pPr>
+            <w:r>
+              <w:rPr>
+                <w:rFonts w:ascii="Times New Roman" w:hAnsi="Times New Roman" w:eastAsia="宋体"/>
+                <w:b w:val="0"/>
+                <w:sz w:val="15"/>
+              </w:rPr>
+              <w:t>出勤良好，偶有轻微迟到或规范疏漏</w:t>
+            </w:r>
+          </w:p>
+        </w:tc>
+        <w:tc>
+          <w:tcPr>
+            <w:tcW w:type="dxa" w:w="1460"/>
+            <w:vAlign w:val="center"/>
+          </w:tcPr>
+          <w:p>
+            <w:pPr>
+              <w:spacing w:before="0" w:after="0" w:line="240" w:lineRule="auto"/>
+              <w:jc w:val="left"/>
+            </w:pPr>
+            <w:r>
+              <w:rPr>
+                <w:rFonts w:ascii="Times New Roman" w:hAnsi="Times New Roman" w:eastAsia="宋体"/>
+                <w:b w:val="0"/>
+                <w:sz w:val="15"/>
+              </w:rPr>
+              <w:t>出勤基本正常，能遵守主要规范</w:t>
+            </w:r>
+          </w:p>
+        </w:tc>
+        <w:tc>
+          <w:tcPr>
+            <w:tcW w:type="dxa" w:w="1460"/>
+            <w:vAlign w:val="center"/>
+          </w:tcPr>
+          <w:p>
+            <w:pPr>
+              <w:spacing w:before="0" w:after="0" w:line="240" w:lineRule="auto"/>
+              <w:jc w:val="left"/>
+            </w:pPr>
+            <w:r>
+              <w:rPr>
+                <w:rFonts w:ascii="Times New Roman" w:hAnsi="Times New Roman" w:eastAsia="宋体"/>
+                <w:b w:val="0"/>
+                <w:sz w:val="15"/>
+              </w:rPr>
+              <w:t>达到最低出勤要求，经提醒能遵守规范</w:t>
+            </w:r>
+          </w:p>
+        </w:tc>
+        <w:tc>
+          <w:tcPr>
+            <w:tcW w:type="dxa" w:w="1464"/>
+            <w:vAlign w:val="center"/>
+          </w:tcPr>
+          <w:p>
+            <w:pPr>
+              <w:spacing w:before="0" w:after="0" w:line="240" w:lineRule="auto"/>
+              <w:jc w:val="left"/>
+            </w:pPr>
+            <w:r>
+              <w:rPr>
+                <w:rFonts w:ascii="Times New Roman" w:hAnsi="Times New Roman" w:eastAsia="宋体"/>
+                <w:b w:val="0"/>
+                <w:sz w:val="15"/>
+              </w:rPr>
+              <w:t>缺勤较多或多次违反课堂、诚信或工具使用规范</w:t>
+            </w:r>
+          </w:p>
+        </w:tc>
+      </w:tr>
+      <w:tr>
+        <w:trPr>
+          <w:cantSplit/>
+        </w:trPr>
+        <w:tc>
+          <w:tcPr>
+            <w:tcW w:type="dxa" w:w="1250"/>
+            <w:vAlign w:val="center"/>
+          </w:tcPr>
+          <w:p>
+            <w:pPr>
+              <w:spacing w:before="0" w:after="0" w:line="240" w:lineRule="auto"/>
+              <w:jc w:val="left"/>
+            </w:pPr>
+            <w:r>
+              <w:rPr>
+                <w:rFonts w:ascii="Times New Roman" w:hAnsi="Times New Roman" w:eastAsia="宋体"/>
                 <w:b/>
                 <w:sz w:val="15"/>
-                <w:lang w:eastAsia="zh-CN"/>
               </w:rPr>
-              <w:t>考勤与课堂规范</w:t>
+              <w:t>课堂阅读、讨论与口头参与</w:t>
             </w:r>
           </w:p>
         </w:tc>
         <w:tc>
           <w:tcPr>
             <w:tcW w:type="dxa" w:w="700"/>
+            <w:vAlign w:val="center"/>
           </w:tcPr>
           <w:p>
             <w:pPr>
               <w:spacing w:before="0" w:after="0" w:line="240" w:lineRule="auto"/>
               <w:jc w:val="center"/>
             </w:pPr>
-            <w:r/>
             <w:r>
               <w:rPr>
-                <w:rFonts w:ascii="Times New Roman" w:hAnsi="Times New Roman" w:cs="Times New Roman" w:eastAsia="宋体" w:hint="eastAsia"/>
+                <w:rFonts w:ascii="Times New Roman" w:hAnsi="Times New Roman" w:eastAsia="宋体"/>
                 <w:b w:val="0"/>
                 <w:sz w:val="15"/>
-                <w:lang w:eastAsia="zh-CN"/>
               </w:rPr>
               <w:t>30%</w:t>
             </w:r>
@@ -6069,105 +6154,100 @@
         <w:tc>
           <w:tcPr>
             <w:tcW w:type="dxa" w:w="1460"/>
+            <w:vAlign w:val="center"/>
           </w:tcPr>
           <w:p>
             <w:pPr>
               <w:spacing w:before="0" w:after="0" w:line="240" w:lineRule="auto"/>
               <w:jc w:val="left"/>
             </w:pPr>
-            <w:r/>
             <w:r>
               <w:rPr>
-                <w:rFonts w:ascii="Times New Roman" w:hAnsi="Times New Roman" w:cs="Times New Roman" w:eastAsia="宋体" w:hint="eastAsia"/>
+                <w:rFonts w:ascii="Times New Roman" w:hAnsi="Times New Roman" w:eastAsia="宋体"/>
                 <w:b w:val="0"/>
                 <w:sz w:val="15"/>
-                <w:lang w:eastAsia="zh-CN"/>
               </w:rPr>
-              <w:t>出勤完整，准备充分，严格遵守课堂、引用和工具使用规范</w:t>
+              <w:t>主动定位原文证据、参与双语讨论和角色任务，表达清楚且术语准确</w:t>
             </w:r>
           </w:p>
         </w:tc>
         <w:tc>
           <w:tcPr>
             <w:tcW w:type="dxa" w:w="1460"/>
+            <w:vAlign w:val="center"/>
           </w:tcPr>
           <w:p>
             <w:pPr>
               <w:spacing w:before="0" w:after="0" w:line="240" w:lineRule="auto"/>
               <w:jc w:val="left"/>
             </w:pPr>
-            <w:r/>
             <w:r>
               <w:rPr>
-                <w:rFonts w:ascii="Times New Roman" w:hAnsi="Times New Roman" w:cs="Times New Roman" w:eastAsia="宋体" w:hint="eastAsia"/>
+                <w:rFonts w:ascii="Times New Roman" w:hAnsi="Times New Roman" w:eastAsia="宋体"/>
                 <w:b w:val="0"/>
                 <w:sz w:val="15"/>
-                <w:lang w:eastAsia="zh-CN"/>
               </w:rPr>
-              <w:t>出勤良好，偶有轻微迟到或规范疏漏</w:t>
+              <w:t>能够参与主要活动并较清楚表达观点</w:t>
             </w:r>
           </w:p>
         </w:tc>
         <w:tc>
           <w:tcPr>
             <w:tcW w:type="dxa" w:w="1460"/>
+            <w:vAlign w:val="center"/>
           </w:tcPr>
           <w:p>
             <w:pPr>
               <w:spacing w:before="0" w:after="0" w:line="240" w:lineRule="auto"/>
               <w:jc w:val="left"/>
             </w:pPr>
-            <w:r/>
             <w:r>
               <w:rPr>
-                <w:rFonts w:ascii="Times New Roman" w:hAnsi="Times New Roman" w:cs="Times New Roman" w:eastAsia="宋体" w:hint="eastAsia"/>
+                <w:rFonts w:ascii="Times New Roman" w:hAnsi="Times New Roman" w:eastAsia="宋体"/>
                 <w:b w:val="0"/>
                 <w:sz w:val="15"/>
-                <w:lang w:eastAsia="zh-CN"/>
               </w:rPr>
-              <w:t>出勤基本正常，能遵守主要规范</w:t>
+              <w:t>基本参与课堂任务并完成主要要求</w:t>
             </w:r>
           </w:p>
         </w:tc>
         <w:tc>
           <w:tcPr>
             <w:tcW w:type="dxa" w:w="1460"/>
+            <w:vAlign w:val="center"/>
           </w:tcPr>
           <w:p>
             <w:pPr>
               <w:spacing w:before="0" w:after="0" w:line="240" w:lineRule="auto"/>
               <w:jc w:val="left"/>
             </w:pPr>
-            <w:r/>
             <w:r>
               <w:rPr>
-                <w:rFonts w:ascii="Times New Roman" w:hAnsi="Times New Roman" w:cs="Times New Roman" w:eastAsia="宋体" w:hint="eastAsia"/>
+                <w:rFonts w:ascii="Times New Roman" w:hAnsi="Times New Roman" w:eastAsia="宋体"/>
                 <w:b w:val="0"/>
                 <w:sz w:val="15"/>
-                <w:lang w:eastAsia="zh-CN"/>
               </w:rPr>
-              <w:t>达到最低出勤要求，经提醒能遵守规范</w:t>
+              <w:t>经提醒可以参与并完成基础任务</w:t>
             </w:r>
           </w:p>
         </w:tc>
         <w:tc>
           <w:tcPr>
             <w:tcW w:type="dxa" w:w="1464"/>
+            <w:vAlign w:val="center"/>
           </w:tcPr>
           <w:p>
             <w:pPr>
               <w:spacing w:before="0" w:after="0" w:line="240" w:lineRule="auto"/>
               <w:jc w:val="left"/>
             </w:pPr>
-            <w:r/>
             <w:r>
               <w:rPr>
-                <w:rFonts w:ascii="Times New Roman" w:hAnsi="Times New Roman" w:cs="Times New Roman" w:eastAsia="宋体" w:hint="eastAsia"/>
+                <w:rFonts w:ascii="Times New Roman" w:hAnsi="Times New Roman" w:eastAsia="宋体"/>
                 <w:b w:val="0"/>
                 <w:sz w:val="15"/>
-                <w:lang w:eastAsia="zh-CN"/>
               </w:rPr>
-              <w:t>缺勤较多或多次违反课堂、诚信或工具使用规范</w:t>
+              <w:t>长期不参与或无法完成基本交流任务</w:t>
             </w:r>
           </w:p>
         </w:tc>
@@ -6179,299 +6259,285 @@
         <w:tc>
           <w:tcPr>
             <w:tcW w:type="dxa" w:w="1250"/>
+            <w:vAlign w:val="center"/>
+          </w:tcPr>
+          <w:p>
+            <w:pPr>
+              <w:spacing w:before="0" w:after="0" w:line="240" w:lineRule="auto"/>
+              <w:jc w:val="left"/>
+            </w:pPr>
+            <w:r>
+              <w:rPr>
+                <w:rFonts w:ascii="Times New Roman" w:hAnsi="Times New Roman" w:eastAsia="宋体"/>
+                <w:b/>
+                <w:sz w:val="15"/>
+              </w:rPr>
+              <w:t>术语、笔记与学习档案</w:t>
+            </w:r>
+          </w:p>
+        </w:tc>
+        <w:tc>
+          <w:tcPr>
+            <w:tcW w:type="dxa" w:w="700"/>
+            <w:vAlign w:val="center"/>
           </w:tcPr>
           <w:p>
             <w:pPr>
               <w:spacing w:before="0" w:after="0" w:line="240" w:lineRule="auto"/>
               <w:jc w:val="center"/>
             </w:pPr>
-            <w:r/>
             <w:r>
               <w:rPr>
-                <w:rFonts w:ascii="Times New Roman" w:hAnsi="Times New Roman" w:cs="Times New Roman" w:eastAsia="宋体" w:hint="eastAsia"/>
+                <w:rFonts w:ascii="Times New Roman" w:hAnsi="Times New Roman" w:eastAsia="宋体"/>
+                <w:b w:val="0"/>
+                <w:sz w:val="15"/>
+              </w:rPr>
+              <w:t>30%</w:t>
+            </w:r>
+          </w:p>
+        </w:tc>
+        <w:tc>
+          <w:tcPr>
+            <w:tcW w:type="dxa" w:w="1460"/>
+            <w:vAlign w:val="center"/>
+          </w:tcPr>
+          <w:p>
+            <w:pPr>
+              <w:spacing w:before="0" w:after="0" w:line="240" w:lineRule="auto"/>
+              <w:jc w:val="left"/>
+            </w:pPr>
+            <w:r>
+              <w:rPr>
+                <w:rFonts w:ascii="Times New Roman" w:hAnsi="Times New Roman" w:eastAsia="宋体"/>
+                <w:b w:val="0"/>
+                <w:sz w:val="15"/>
+              </w:rPr>
+              <w:t>术语表、阅读卡、翻译修改和来源记录完整、准确、持续更新并有反思</w:t>
+            </w:r>
+          </w:p>
+        </w:tc>
+        <w:tc>
+          <w:tcPr>
+            <w:tcW w:type="dxa" w:w="1460"/>
+            <w:vAlign w:val="center"/>
+          </w:tcPr>
+          <w:p>
+            <w:pPr>
+              <w:spacing w:before="0" w:after="0" w:line="240" w:lineRule="auto"/>
+              <w:jc w:val="left"/>
+            </w:pPr>
+            <w:r>
+              <w:rPr>
+                <w:rFonts w:ascii="Times New Roman" w:hAnsi="Times New Roman" w:eastAsia="宋体"/>
+                <w:b w:val="0"/>
+                <w:sz w:val="15"/>
+              </w:rPr>
+              <w:t>记录较完整，术语基本一致，少量问题可自主修正</w:t>
+            </w:r>
+          </w:p>
+        </w:tc>
+        <w:tc>
+          <w:tcPr>
+            <w:tcW w:type="dxa" w:w="1460"/>
+            <w:vAlign w:val="center"/>
+          </w:tcPr>
+          <w:p>
+            <w:pPr>
+              <w:spacing w:before="0" w:after="0" w:line="240" w:lineRule="auto"/>
+              <w:jc w:val="left"/>
+            </w:pPr>
+            <w:r>
+              <w:rPr>
+                <w:rFonts w:ascii="Times New Roman" w:hAnsi="Times New Roman" w:eastAsia="宋体"/>
+                <w:b w:val="0"/>
+                <w:sz w:val="15"/>
+              </w:rPr>
+              <w:t>完成主要记录，有基本来源和修订痕迹</w:t>
+            </w:r>
+          </w:p>
+        </w:tc>
+        <w:tc>
+          <w:tcPr>
+            <w:tcW w:type="dxa" w:w="1460"/>
+            <w:vAlign w:val="center"/>
+          </w:tcPr>
+          <w:p>
+            <w:pPr>
+              <w:spacing w:before="0" w:after="0" w:line="240" w:lineRule="auto"/>
+              <w:jc w:val="left"/>
+            </w:pPr>
+            <w:r>
+              <w:rPr>
+                <w:rFonts w:ascii="Times New Roman" w:hAnsi="Times New Roman" w:eastAsia="宋体"/>
+                <w:b w:val="0"/>
+                <w:sz w:val="15"/>
+              </w:rPr>
+              <w:t>在指导下达到最低记录要求</w:t>
+            </w:r>
+          </w:p>
+        </w:tc>
+        <w:tc>
+          <w:tcPr>
+            <w:tcW w:type="dxa" w:w="1464"/>
+            <w:vAlign w:val="center"/>
+          </w:tcPr>
+          <w:p>
+            <w:pPr>
+              <w:spacing w:before="0" w:after="0" w:line="240" w:lineRule="auto"/>
+              <w:jc w:val="left"/>
+            </w:pPr>
+            <w:r>
+              <w:rPr>
+                <w:rFonts w:ascii="Times New Roman" w:hAnsi="Times New Roman" w:eastAsia="宋体"/>
+                <w:b w:val="0"/>
+                <w:sz w:val="15"/>
+              </w:rPr>
+              <w:t>大量缺交、来源不明或无法解释提交内容</w:t>
+            </w:r>
+          </w:p>
+        </w:tc>
+      </w:tr>
+      <w:tr>
+        <w:trPr>
+          <w:cantSplit/>
+        </w:trPr>
+        <w:tc>
+          <w:tcPr>
+            <w:tcW w:type="dxa" w:w="1250"/>
+            <w:vAlign w:val="center"/>
+          </w:tcPr>
+          <w:p>
+            <w:pPr>
+              <w:spacing w:before="0" w:after="0" w:line="240" w:lineRule="auto"/>
+              <w:jc w:val="left"/>
+            </w:pPr>
+            <w:r>
+              <w:rPr>
+                <w:rFonts w:ascii="Times New Roman" w:hAnsi="Times New Roman" w:eastAsia="宋体"/>
                 <w:b/>
                 <w:sz w:val="15"/>
-                <w:lang w:eastAsia="zh-CN"/>
               </w:rPr>
-              <w:t>课堂阅读、讨论与口头参与</w:t>
+              <w:t>学术诚信与工具使用规范</w:t>
             </w:r>
           </w:p>
         </w:tc>
         <w:tc>
           <w:tcPr>
             <w:tcW w:type="dxa" w:w="700"/>
+            <w:vAlign w:val="center"/>
           </w:tcPr>
           <w:p>
             <w:pPr>
               <w:spacing w:before="0" w:after="0" w:line="240" w:lineRule="auto"/>
               <w:jc w:val="center"/>
             </w:pPr>
-            <w:r/>
             <w:r>
               <w:rPr>
-                <w:rFonts w:ascii="Times New Roman" w:hAnsi="Times New Roman" w:cs="Times New Roman" w:eastAsia="宋体" w:hint="eastAsia"/>
+                <w:rFonts w:ascii="Times New Roman" w:hAnsi="Times New Roman" w:eastAsia="宋体"/>
                 <w:b w:val="0"/>
                 <w:sz w:val="15"/>
-                <w:lang w:eastAsia="zh-CN"/>
               </w:rPr>
-              <w:t>30%</w:t>
+              <w:t>15%</w:t>
             </w:r>
           </w:p>
         </w:tc>
         <w:tc>
           <w:tcPr>
             <w:tcW w:type="dxa" w:w="1460"/>
+            <w:vAlign w:val="center"/>
           </w:tcPr>
           <w:p>
             <w:pPr>
               <w:spacing w:before="0" w:after="0" w:line="240" w:lineRule="auto"/>
               <w:jc w:val="left"/>
             </w:pPr>
-            <w:r/>
             <w:r>
               <w:rPr>
-                <w:rFonts w:ascii="Times New Roman" w:hAnsi="Times New Roman" w:cs="Times New Roman" w:eastAsia="宋体" w:hint="eastAsia"/>
+                <w:rFonts w:ascii="Times New Roman" w:hAnsi="Times New Roman" w:eastAsia="宋体"/>
                 <w:b w:val="0"/>
                 <w:sz w:val="15"/>
-                <w:lang w:eastAsia="zh-CN"/>
               </w:rPr>
-              <w:t>主动定位原文证据、参与双语讨论和角色任务，表达清楚且术语准确</w:t>
+              <w:t>引用、来源和机器翻译/AI使用记录完整，能够主动核验事实、术语、数字和单位</w:t>
             </w:r>
           </w:p>
         </w:tc>
         <w:tc>
           <w:tcPr>
             <w:tcW w:type="dxa" w:w="1460"/>
+            <w:vAlign w:val="center"/>
           </w:tcPr>
           <w:p>
             <w:pPr>
               <w:spacing w:before="0" w:after="0" w:line="240" w:lineRule="auto"/>
               <w:jc w:val="left"/>
             </w:pPr>
-            <w:r/>
             <w:r>
               <w:rPr>
-                <w:rFonts w:ascii="Times New Roman" w:hAnsi="Times New Roman" w:cs="Times New Roman" w:eastAsia="宋体" w:hint="eastAsia"/>
+                <w:rFonts w:ascii="Times New Roman" w:hAnsi="Times New Roman" w:eastAsia="宋体"/>
                 <w:b w:val="0"/>
                 <w:sz w:val="15"/>
-                <w:lang w:eastAsia="zh-CN"/>
               </w:rPr>
-              <w:t>能够参与主要活动并较清楚表达观点</w:t>
+              <w:t>记录较完整，能修正主要工具错误</w:t>
             </w:r>
           </w:p>
         </w:tc>
         <w:tc>
           <w:tcPr>
             <w:tcW w:type="dxa" w:w="1460"/>
+            <w:vAlign w:val="center"/>
           </w:tcPr>
           <w:p>
             <w:pPr>
               <w:spacing w:before="0" w:after="0" w:line="240" w:lineRule="auto"/>
               <w:jc w:val="left"/>
             </w:pPr>
-            <w:r/>
             <w:r>
               <w:rPr>
-                <w:rFonts w:ascii="Times New Roman" w:hAnsi="Times New Roman" w:cs="Times New Roman" w:eastAsia="宋体" w:hint="eastAsia"/>
+                <w:rFonts w:ascii="Times New Roman" w:hAnsi="Times New Roman" w:eastAsia="宋体"/>
                 <w:b w:val="0"/>
                 <w:sz w:val="15"/>
-                <w:lang w:eastAsia="zh-CN"/>
               </w:rPr>
-              <w:t>基本参与课堂任务并完成主要要求</w:t>
+              <w:t>有基本来源与工具记录，能完成主要核验</w:t>
             </w:r>
           </w:p>
         </w:tc>
         <w:tc>
           <w:tcPr>
             <w:tcW w:type="dxa" w:w="1460"/>
+            <w:vAlign w:val="center"/>
           </w:tcPr>
           <w:p>
             <w:pPr>
               <w:spacing w:before="0" w:after="0" w:line="240" w:lineRule="auto"/>
               <w:jc w:val="left"/>
             </w:pPr>
-            <w:r/>
             <w:r>
               <w:rPr>
-                <w:rFonts w:ascii="Times New Roman" w:hAnsi="Times New Roman" w:cs="Times New Roman" w:eastAsia="宋体" w:hint="eastAsia"/>
+                <w:rFonts w:ascii="Times New Roman" w:hAnsi="Times New Roman" w:eastAsia="宋体"/>
                 <w:b w:val="0"/>
                 <w:sz w:val="15"/>
-                <w:lang w:eastAsia="zh-CN"/>
               </w:rPr>
-              <w:t>经提醒可以参与并完成基础任务</w:t>
+              <w:t>经指导可以完成最低披露和核验要求</w:t>
             </w:r>
           </w:p>
         </w:tc>
         <w:tc>
           <w:tcPr>
             <w:tcW w:type="dxa" w:w="1464"/>
+            <w:vAlign w:val="center"/>
           </w:tcPr>
           <w:p>
             <w:pPr>
               <w:spacing w:before="0" w:after="0" w:line="240" w:lineRule="auto"/>
               <w:jc w:val="left"/>
             </w:pPr>
-            <w:r/>
             <w:r>
               <w:rPr>
-                <w:rFonts w:ascii="Times New Roman" w:hAnsi="Times New Roman" w:cs="Times New Roman" w:eastAsia="宋体" w:hint="eastAsia"/>
+                <w:rFonts w:ascii="Times New Roman" w:hAnsi="Times New Roman" w:eastAsia="宋体"/>
                 <w:b w:val="0"/>
                 <w:sz w:val="15"/>
-                <w:lang w:eastAsia="zh-CN"/>
               </w:rPr>
-              <w:t>长期不参与或无法完成基本交流任务</w:t>
-            </w:r>
-          </w:p>
-        </w:tc>
-      </w:tr>
-      <w:tr>
-        <w:trPr>
-          <w:cantSplit/>
-        </w:trPr>
-        <w:tc>
-          <w:tcPr>
-            <w:tcW w:type="dxa" w:w="1250"/>
-          </w:tcPr>
-          <w:p>
-            <w:pPr>
-              <w:spacing w:before="0" w:after="0" w:line="240" w:lineRule="auto"/>
-              <w:jc w:val="center"/>
-            </w:pPr>
-            <w:r/>
-            <w:r>
-              <w:rPr>
-                <w:rFonts w:ascii="Times New Roman" w:hAnsi="Times New Roman" w:cs="Times New Roman" w:eastAsia="宋体" w:hint="eastAsia"/>
-                <w:b/>
-                <w:sz w:val="15"/>
-                <w:lang w:eastAsia="zh-CN"/>
-              </w:rPr>
-              <w:t>术语、笔记与学习档案</w:t>
-            </w:r>
-          </w:p>
-        </w:tc>
-        <w:tc>
-          <w:tcPr>
-            <w:tcW w:type="dxa" w:w="700"/>
-          </w:tcPr>
-          <w:p>
-            <w:pPr>
-              <w:spacing w:before="0" w:after="0" w:line="240" w:lineRule="auto"/>
-              <w:jc w:val="center"/>
-            </w:pPr>
-            <w:r/>
-            <w:r>
-              <w:rPr>
-                <w:rFonts w:ascii="Times New Roman" w:hAnsi="Times New Roman" w:cs="Times New Roman" w:eastAsia="宋体" w:hint="eastAsia"/>
-                <w:b w:val="0"/>
-                <w:sz w:val="15"/>
-                <w:lang w:eastAsia="zh-CN"/>
-              </w:rPr>
-              <w:t>40%</w:t>
-            </w:r>
-          </w:p>
-        </w:tc>
-        <w:tc>
-          <w:tcPr>
-            <w:tcW w:type="dxa" w:w="1460"/>
-          </w:tcPr>
-          <w:p>
-            <w:pPr>
-              <w:spacing w:before="0" w:after="0" w:line="240" w:lineRule="auto"/>
-              <w:jc w:val="left"/>
-            </w:pPr>
-            <w:r/>
-            <w:r>
-              <w:rPr>
-                <w:rFonts w:ascii="Times New Roman" w:hAnsi="Times New Roman" w:cs="Times New Roman" w:eastAsia="宋体" w:hint="eastAsia"/>
-                <w:b w:val="0"/>
-                <w:sz w:val="15"/>
-                <w:lang w:eastAsia="zh-CN"/>
-              </w:rPr>
-              <w:t>术语表、阅读卡、翻译修改和来源记录完整、准确、持续更新并有反思</w:t>
-            </w:r>
-          </w:p>
-        </w:tc>
-        <w:tc>
-          <w:tcPr>
-            <w:tcW w:type="dxa" w:w="1460"/>
-          </w:tcPr>
-          <w:p>
-            <w:pPr>
-              <w:spacing w:before="0" w:after="0" w:line="240" w:lineRule="auto"/>
-              <w:jc w:val="left"/>
-            </w:pPr>
-            <w:r/>
-            <w:r>
-              <w:rPr>
-                <w:rFonts w:ascii="Times New Roman" w:hAnsi="Times New Roman" w:cs="Times New Roman" w:eastAsia="宋体" w:hint="eastAsia"/>
-                <w:b w:val="0"/>
-                <w:sz w:val="15"/>
-                <w:lang w:eastAsia="zh-CN"/>
-              </w:rPr>
-              <w:t>记录较完整，术语基本一致，少量问题可自主修正</w:t>
-            </w:r>
-          </w:p>
-        </w:tc>
-        <w:tc>
-          <w:tcPr>
-            <w:tcW w:type="dxa" w:w="1460"/>
-          </w:tcPr>
-          <w:p>
-            <w:pPr>
-              <w:spacing w:before="0" w:after="0" w:line="240" w:lineRule="auto"/>
-              <w:jc w:val="left"/>
-            </w:pPr>
-            <w:r/>
-            <w:r>
-              <w:rPr>
-                <w:rFonts w:ascii="Times New Roman" w:hAnsi="Times New Roman" w:cs="Times New Roman" w:eastAsia="宋体" w:hint="eastAsia"/>
-                <w:b w:val="0"/>
-                <w:sz w:val="15"/>
-                <w:lang w:eastAsia="zh-CN"/>
-              </w:rPr>
-              <w:t>完成主要记录，有基本来源和修订痕迹</w:t>
-            </w:r>
-          </w:p>
-        </w:tc>
-        <w:tc>
-          <w:tcPr>
-            <w:tcW w:type="dxa" w:w="1460"/>
-          </w:tcPr>
-          <w:p>
-            <w:pPr>
-              <w:spacing w:before="0" w:after="0" w:line="240" w:lineRule="auto"/>
-              <w:jc w:val="left"/>
-            </w:pPr>
-            <w:r/>
-            <w:r>
-              <w:rPr>
-                <w:rFonts w:ascii="Times New Roman" w:hAnsi="Times New Roman" w:cs="Times New Roman" w:eastAsia="宋体" w:hint="eastAsia"/>
-                <w:b w:val="0"/>
-                <w:sz w:val="15"/>
-                <w:lang w:eastAsia="zh-CN"/>
-              </w:rPr>
-              <w:t>在指导下达到最低记录要求</w:t>
-            </w:r>
-          </w:p>
-        </w:tc>
-        <w:tc>
-          <w:tcPr>
-            <w:tcW w:type="dxa" w:w="1464"/>
-          </w:tcPr>
-          <w:p>
-            <w:pPr>
-              <w:spacing w:before="0" w:after="0" w:line="240" w:lineRule="auto"/>
-              <w:jc w:val="left"/>
-            </w:pPr>
-            <w:r/>
-            <w:r>
-              <w:rPr>
-                <w:rFonts w:ascii="Times New Roman" w:hAnsi="Times New Roman" w:cs="Times New Roman" w:eastAsia="宋体" w:hint="eastAsia"/>
-                <w:b w:val="0"/>
-                <w:sz w:val="15"/>
-                <w:lang w:eastAsia="zh-CN"/>
-              </w:rPr>
-              <w:t>大量缺交、来源不明或无法解释提交内容</w:t>
+              <w:t>存在来源隐瞒、虚构引用、代替本人完成或无法解释的提交内容</w:t>
             </w:r>
           </w:p>
         </w:tc>
@@ -6481,16 +6547,15 @@
     <w:p>
       <w:pPr>
         <w:keepNext/>
-        <w:spacing w:before="80" w:after="40"/>
+        <w:spacing w:before="0" w:after="0" w:line="276" w:lineRule="auto"/>
       </w:pPr>
       <w:r>
         <w:rPr>
-          <w:rFonts w:ascii="Times New Roman" w:hAnsi="Times New Roman" w:cs="Times New Roman" w:eastAsia="宋体" w:hint="eastAsia"/>
+          <w:rFonts w:ascii="Times New Roman" w:hAnsi="Times New Roman" w:eastAsia="宋体"/>
           <w:b/>
           <w:sz w:val="24"/>
-          <w:lang w:eastAsia="zh-CN"/>
         </w:rPr>
-        <w:t>（2）专业阅读与术语任务评分标准</w:t>
+        <w:t>（2）课程作业评分标准</w:t>
       </w:r>
     </w:p>
     <w:tbl>
@@ -6534,13 +6599,11 @@
               <w:spacing w:before="0" w:after="0" w:line="240" w:lineRule="auto"/>
               <w:jc w:val="center"/>
             </w:pPr>
-            <w:r/>
             <w:r>
               <w:rPr>
-                <w:rFonts w:ascii="Times New Roman" w:hAnsi="Times New Roman" w:cs="Times New Roman" w:eastAsia="宋体" w:hint="eastAsia"/>
+                <w:rFonts w:ascii="Times New Roman" w:hAnsi="Times New Roman" w:eastAsia="宋体"/>
                 <w:b/>
                 <w:sz w:val="16"/>
-                <w:lang w:eastAsia="zh-CN"/>
               </w:rPr>
               <w:t>考核内容</w:t>
             </w:r>
@@ -6562,13 +6625,11 @@
               <w:spacing w:before="0" w:after="0" w:line="240" w:lineRule="auto"/>
               <w:jc w:val="center"/>
             </w:pPr>
-            <w:r/>
             <w:r>
               <w:rPr>
-                <w:rFonts w:ascii="Times New Roman" w:hAnsi="Times New Roman" w:cs="Times New Roman" w:eastAsia="宋体" w:hint="eastAsia"/>
+                <w:rFonts w:ascii="Times New Roman" w:hAnsi="Times New Roman" w:eastAsia="宋体"/>
                 <w:b/>
                 <w:sz w:val="16"/>
-                <w:lang w:eastAsia="zh-CN"/>
               </w:rPr>
               <w:t>成绩占比</w:t>
             </w:r>
@@ -6590,13 +6651,11 @@
               <w:spacing w:before="0" w:after="0" w:line="240" w:lineRule="auto"/>
               <w:jc w:val="center"/>
             </w:pPr>
-            <w:r/>
             <w:r>
               <w:rPr>
-                <w:rFonts w:ascii="Times New Roman" w:hAnsi="Times New Roman" w:cs="Times New Roman" w:eastAsia="宋体" w:hint="eastAsia"/>
+                <w:rFonts w:ascii="Times New Roman" w:hAnsi="Times New Roman" w:eastAsia="宋体"/>
                 <w:b/>
                 <w:sz w:val="16"/>
-                <w:lang w:eastAsia="zh-CN"/>
               </w:rPr>
               <w:t>考核目标与评分要求</w:t>
             </w:r>
@@ -6618,13 +6677,11 @@
               <w:spacing w:before="0" w:after="0" w:line="240" w:lineRule="auto"/>
               <w:jc w:val="center"/>
             </w:pPr>
-            <w:r/>
             <w:r>
               <w:rPr>
-                <w:rFonts w:ascii="Times New Roman" w:hAnsi="Times New Roman" w:cs="Times New Roman" w:eastAsia="宋体" w:hint="eastAsia"/>
+                <w:rFonts w:ascii="Times New Roman" w:hAnsi="Times New Roman" w:eastAsia="宋体"/>
                 <w:b/>
                 <w:sz w:val="16"/>
-                <w:lang w:eastAsia="zh-CN"/>
               </w:rPr>
               <w:t>课程目标</w:t>
             </w:r>
@@ -6638,40 +6695,38 @@
         <w:tc>
           <w:tcPr>
             <w:tcW w:type="dxa" w:w="1600"/>
+            <w:vAlign w:val="center"/>
           </w:tcPr>
           <w:p>
             <w:pPr>
               <w:spacing w:before="0" w:after="0" w:line="240" w:lineRule="auto"/>
               <w:jc w:val="left"/>
             </w:pPr>
-            <w:r/>
             <w:r>
               <w:rPr>
-                <w:rFonts w:ascii="Times New Roman" w:hAnsi="Times New Roman" w:cs="Times New Roman" w:eastAsia="宋体" w:hint="eastAsia"/>
+                <w:rFonts w:ascii="Times New Roman" w:hAnsi="Times New Roman" w:eastAsia="宋体"/>
                 <w:b w:val="0"/>
                 <w:sz w:val="16"/>
-                <w:lang w:eastAsia="zh-CN"/>
               </w:rPr>
-              <w:t>专业英语基础与术语库</w:t>
+              <w:t>专业阅读与证据定位</w:t>
             </w:r>
           </w:p>
         </w:tc>
         <w:tc>
           <w:tcPr>
             <w:tcW w:type="dxa" w:w="850"/>
+            <w:vAlign w:val="center"/>
           </w:tcPr>
           <w:p>
             <w:pPr>
               <w:spacing w:before="0" w:after="0" w:line="240" w:lineRule="auto"/>
               <w:jc w:val="center"/>
             </w:pPr>
-            <w:r/>
             <w:r>
               <w:rPr>
-                <w:rFonts w:ascii="Times New Roman" w:hAnsi="Times New Roman" w:cs="Times New Roman" w:eastAsia="宋体" w:hint="eastAsia"/>
+                <w:rFonts w:ascii="Times New Roman" w:hAnsi="Times New Roman" w:eastAsia="宋体"/>
                 <w:b w:val="0"/>
                 <w:sz w:val="16"/>
-                <w:lang w:eastAsia="zh-CN"/>
               </w:rPr>
               <w:t>20%</w:t>
             </w:r>
@@ -6680,42 +6735,40 @@
         <w:tc>
           <w:tcPr>
             <w:tcW w:type="dxa" w:w="5050"/>
+            <w:vAlign w:val="center"/>
           </w:tcPr>
           <w:p>
             <w:pPr>
               <w:spacing w:before="0" w:after="0" w:line="240" w:lineRule="auto"/>
               <w:jc w:val="left"/>
             </w:pPr>
-            <w:r/>
             <w:r>
               <w:rPr>
-                <w:rFonts w:ascii="Times New Roman" w:hAnsi="Times New Roman" w:cs="Times New Roman" w:eastAsia="宋体" w:hint="eastAsia"/>
+                <w:rFonts w:ascii="Times New Roman" w:hAnsi="Times New Roman" w:eastAsia="宋体"/>
                 <w:b w:val="0"/>
                 <w:sz w:val="16"/>
-                <w:lang w:eastAsia="zh-CN"/>
               </w:rPr>
-              <w:t>能够识别构词、缩略语、单位和典型句式，术语条目含定义、语境、来源和推荐译法。</w:t>
+              <w:t>能够从机械、智能装备、工业互联及智能工厂资料中提取对象、参数、过程、条件、结果与限制，关键判断有原文或图表证据。</w:t>
             </w:r>
           </w:p>
         </w:tc>
         <w:tc>
           <w:tcPr>
             <w:tcW w:type="dxa" w:w="1550"/>
+            <w:vAlign w:val="center"/>
           </w:tcPr>
           <w:p>
             <w:pPr>
               <w:spacing w:before="0" w:after="0" w:line="240" w:lineRule="auto"/>
               <w:jc w:val="center"/>
             </w:pPr>
-            <w:r/>
             <w:r>
               <w:rPr>
-                <w:rFonts w:ascii="Times New Roman" w:hAnsi="Times New Roman" w:cs="Times New Roman" w:eastAsia="宋体" w:hint="eastAsia"/>
+                <w:rFonts w:ascii="Times New Roman" w:hAnsi="Times New Roman" w:eastAsia="宋体"/>
                 <w:b w:val="0"/>
                 <w:sz w:val="16"/>
-                <w:lang w:eastAsia="zh-CN"/>
               </w:rPr>
-              <w:t>目标 1.1，2.1，2.2，3.1</w:t>
+              <w:t>目标 1.1—1.4，2.1，2.3，2.5，3.2</w:t>
             </w:r>
           </w:p>
         </w:tc>
@@ -6727,84 +6780,80 @@
         <w:tc>
           <w:tcPr>
             <w:tcW w:type="dxa" w:w="1600"/>
+            <w:vAlign w:val="center"/>
           </w:tcPr>
           <w:p>
             <w:pPr>
               <w:spacing w:before="0" w:after="0" w:line="240" w:lineRule="auto"/>
               <w:jc w:val="left"/>
             </w:pPr>
-            <w:r/>
             <w:r>
               <w:rPr>
-                <w:rFonts w:ascii="Times New Roman" w:hAnsi="Times New Roman" w:cs="Times New Roman" w:eastAsia="宋体" w:hint="eastAsia"/>
+                <w:rFonts w:ascii="Times New Roman" w:hAnsi="Times New Roman" w:eastAsia="宋体"/>
                 <w:b w:val="0"/>
                 <w:sz w:val="16"/>
-                <w:lang w:eastAsia="zh-CN"/>
               </w:rPr>
-              <w:t>机械与制造过程阅读</w:t>
+              <w:t>双语术语管理</w:t>
             </w:r>
           </w:p>
         </w:tc>
         <w:tc>
           <w:tcPr>
             <w:tcW w:type="dxa" w:w="850"/>
+            <w:vAlign w:val="center"/>
           </w:tcPr>
           <w:p>
             <w:pPr>
               <w:spacing w:before="0" w:after="0" w:line="240" w:lineRule="auto"/>
               <w:jc w:val="center"/>
             </w:pPr>
-            <w:r/>
             <w:r>
               <w:rPr>
-                <w:rFonts w:ascii="Times New Roman" w:hAnsi="Times New Roman" w:cs="Times New Roman" w:eastAsia="宋体" w:hint="eastAsia"/>
+                <w:rFonts w:ascii="Times New Roman" w:hAnsi="Times New Roman" w:eastAsia="宋体"/>
                 <w:b w:val="0"/>
                 <w:sz w:val="16"/>
-                <w:lang w:eastAsia="zh-CN"/>
               </w:rPr>
-              <w:t>20%</w:t>
+              <w:t>15%</w:t>
             </w:r>
           </w:p>
         </w:tc>
         <w:tc>
           <w:tcPr>
             <w:tcW w:type="dxa" w:w="5050"/>
+            <w:vAlign w:val="center"/>
           </w:tcPr>
           <w:p>
             <w:pPr>
               <w:spacing w:before="0" w:after="0" w:line="240" w:lineRule="auto"/>
               <w:jc w:val="left"/>
             </w:pPr>
-            <w:r/>
             <w:r>
               <w:rPr>
-                <w:rFonts w:ascii="Times New Roman" w:hAnsi="Times New Roman" w:cs="Times New Roman" w:eastAsia="宋体" w:hint="eastAsia"/>
+                <w:rFonts w:ascii="Times New Roman" w:hAnsi="Times New Roman" w:eastAsia="宋体"/>
                 <w:b w:val="0"/>
                 <w:sz w:val="16"/>
-                <w:lang w:eastAsia="zh-CN"/>
               </w:rPr>
-              <w:t>能够从图样、参数、材料和工艺文本中提取对象、性能、步骤与质量要求，回答有原文证据。</w:t>
+              <w:t>术语、缩略语、单位和中英文名称保持一致，术语条目包含定义、语境、来源和推荐译法，并能处理同义与多义问题。</w:t>
             </w:r>
           </w:p>
         </w:tc>
         <w:tc>
           <w:tcPr>
             <w:tcW w:type="dxa" w:w="1550"/>
+            <w:vAlign w:val="center"/>
           </w:tcPr>
           <w:p>
             <w:pPr>
               <w:spacing w:before="0" w:after="0" w:line="240" w:lineRule="auto"/>
               <w:jc w:val="center"/>
             </w:pPr>
-            <w:r/>
             <w:r>
               <w:rPr>
-                <w:rFonts w:ascii="Times New Roman" w:hAnsi="Times New Roman" w:cs="Times New Roman" w:eastAsia="宋体" w:hint="eastAsia"/>
+                <w:rFonts w:ascii="Times New Roman" w:hAnsi="Times New Roman" w:eastAsia="宋体"/>
                 <w:b w:val="0"/>
                 <w:sz w:val="16"/>
-                <w:lang w:eastAsia="zh-CN"/>
               </w:rPr>
-              <w:t>目标 1.2，2.2，2.3，3.2</w:t>
+              <w:t>目标 1.1，1.2，1.3，2.2，3.1</w:t>
             </w:r>
           </w:p>
         </w:tc>
@@ -6816,40 +6865,38 @@
         <w:tc>
           <w:tcPr>
             <w:tcW w:type="dxa" w:w="1600"/>
+            <w:vAlign w:val="center"/>
           </w:tcPr>
           <w:p>
             <w:pPr>
               <w:spacing w:before="0" w:after="0" w:line="240" w:lineRule="auto"/>
               <w:jc w:val="left"/>
             </w:pPr>
-            <w:r/>
             <w:r>
               <w:rPr>
-                <w:rFonts w:ascii="Times New Roman" w:hAnsi="Times New Roman" w:cs="Times New Roman" w:eastAsia="宋体" w:hint="eastAsia"/>
+                <w:rFonts w:ascii="Times New Roman" w:hAnsi="Times New Roman" w:eastAsia="宋体"/>
                 <w:b w:val="0"/>
                 <w:sz w:val="16"/>
-                <w:lang w:eastAsia="zh-CN"/>
               </w:rPr>
-              <w:t>智能装备主题阅读</w:t>
+              <w:t>技术翻译</w:t>
             </w:r>
           </w:p>
         </w:tc>
         <w:tc>
           <w:tcPr>
             <w:tcW w:type="dxa" w:w="850"/>
+            <w:vAlign w:val="center"/>
           </w:tcPr>
           <w:p>
             <w:pPr>
               <w:spacing w:before="0" w:after="0" w:line="240" w:lineRule="auto"/>
               <w:jc w:val="center"/>
             </w:pPr>
-            <w:r/>
             <w:r>
               <w:rPr>
-                <w:rFonts w:ascii="Times New Roman" w:hAnsi="Times New Roman" w:cs="Times New Roman" w:eastAsia="宋体" w:hint="eastAsia"/>
+                <w:rFonts w:ascii="Times New Roman" w:hAnsi="Times New Roman" w:eastAsia="宋体"/>
                 <w:b w:val="0"/>
                 <w:sz w:val="16"/>
-                <w:lang w:eastAsia="zh-CN"/>
               </w:rPr>
               <w:t>20%</w:t>
             </w:r>
@@ -6858,42 +6905,40 @@
         <w:tc>
           <w:tcPr>
             <w:tcW w:type="dxa" w:w="5050"/>
+            <w:vAlign w:val="center"/>
           </w:tcPr>
           <w:p>
             <w:pPr>
               <w:spacing w:before="0" w:after="0" w:line="240" w:lineRule="auto"/>
               <w:jc w:val="left"/>
             </w:pPr>
-            <w:r/>
             <w:r>
               <w:rPr>
-                <w:rFonts w:ascii="Times New Roman" w:hAnsi="Times New Roman" w:cs="Times New Roman" w:eastAsia="宋体" w:hint="eastAsia"/>
+                <w:rFonts w:ascii="Times New Roman" w:hAnsi="Times New Roman" w:eastAsia="宋体"/>
                 <w:b w:val="0"/>
                 <w:sz w:val="16"/>
-                <w:lang w:eastAsia="zh-CN"/>
               </w:rPr>
-              <w:t>能够理解数控、机器人和增材制造资料中的组成、控制、工艺、性能和限制。</w:t>
+              <w:t>机械/装备/系统技术文本译文事实准确，术语、数字、单位、否定和逻辑关系正确，目标语符合工程语体。</w:t>
             </w:r>
           </w:p>
         </w:tc>
         <w:tc>
           <w:tcPr>
             <w:tcW w:type="dxa" w:w="1550"/>
+            <w:vAlign w:val="center"/>
           </w:tcPr>
           <w:p>
             <w:pPr>
               <w:spacing w:before="0" w:after="0" w:line="240" w:lineRule="auto"/>
               <w:jc w:val="center"/>
             </w:pPr>
-            <w:r/>
             <w:r>
               <w:rPr>
-                <w:rFonts w:ascii="Times New Roman" w:hAnsi="Times New Roman" w:cs="Times New Roman" w:eastAsia="宋体" w:hint="eastAsia"/>
+                <w:rFonts w:ascii="Times New Roman" w:hAnsi="Times New Roman" w:eastAsia="宋体"/>
                 <w:b w:val="0"/>
                 <w:sz w:val="16"/>
-                <w:lang w:eastAsia="zh-CN"/>
               </w:rPr>
-              <w:t>目标 1.2，1.3，2.3，2.5</w:t>
+              <w:t>目标 1.2，1.3，1.5，2.3，3.1，3.2</w:t>
             </w:r>
           </w:p>
         </w:tc>
@@ -6905,84 +6950,80 @@
         <w:tc>
           <w:tcPr>
             <w:tcW w:type="dxa" w:w="1600"/>
+            <w:vAlign w:val="center"/>
           </w:tcPr>
           <w:p>
             <w:pPr>
               <w:spacing w:before="0" w:after="0" w:line="240" w:lineRule="auto"/>
               <w:jc w:val="left"/>
             </w:pPr>
-            <w:r/>
             <w:r>
               <w:rPr>
-                <w:rFonts w:ascii="Times New Roman" w:hAnsi="Times New Roman" w:cs="Times New Roman" w:eastAsia="宋体" w:hint="eastAsia"/>
+                <w:rFonts w:ascii="Times New Roman" w:hAnsi="Times New Roman" w:eastAsia="宋体"/>
                 <w:b w:val="0"/>
                 <w:sz w:val="16"/>
-                <w:lang w:eastAsia="zh-CN"/>
               </w:rPr>
-              <w:t>工业互联与智能工厂阅读</w:t>
+              <w:t>手册、标准、安全与排故任务</w:t>
             </w:r>
           </w:p>
         </w:tc>
         <w:tc>
           <w:tcPr>
             <w:tcW w:type="dxa" w:w="850"/>
+            <w:vAlign w:val="center"/>
           </w:tcPr>
           <w:p>
             <w:pPr>
               <w:spacing w:before="0" w:after="0" w:line="240" w:lineRule="auto"/>
               <w:jc w:val="center"/>
             </w:pPr>
-            <w:r/>
             <w:r>
               <w:rPr>
-                <w:rFonts w:ascii="Times New Roman" w:hAnsi="Times New Roman" w:cs="Times New Roman" w:eastAsia="宋体" w:hint="eastAsia"/>
+                <w:rFonts w:ascii="Times New Roman" w:hAnsi="Times New Roman" w:eastAsia="宋体"/>
                 <w:b w:val="0"/>
                 <w:sz w:val="16"/>
-                <w:lang w:eastAsia="zh-CN"/>
               </w:rPr>
-              <w:t>15%</w:t>
+              <w:t>20%</w:t>
             </w:r>
           </w:p>
         </w:tc>
         <w:tc>
           <w:tcPr>
             <w:tcW w:type="dxa" w:w="5050"/>
+            <w:vAlign w:val="center"/>
           </w:tcPr>
           <w:p>
             <w:pPr>
               <w:spacing w:before="0" w:after="0" w:line="240" w:lineRule="auto"/>
               <w:jc w:val="left"/>
             </w:pPr>
-            <w:r/>
             <w:r>
               <w:rPr>
-                <w:rFonts w:ascii="Times New Roman" w:hAnsi="Times New Roman" w:cs="Times New Roman" w:eastAsia="宋体" w:hint="eastAsia"/>
+                <w:rFonts w:ascii="Times New Roman" w:hAnsi="Times New Roman" w:eastAsia="宋体"/>
                 <w:b w:val="0"/>
                 <w:sz w:val="16"/>
-                <w:lang w:eastAsia="zh-CN"/>
               </w:rPr>
-              <w:t>能够说明传感、控制、网络、CPS、数字孪生、MES和维护之间的系统关系。</w:t>
+              <w:t>能够准确提取并表达强制条款、警示等级、安装/操作条件和故障排查步骤，不弱化安全含义或责任边界。</w:t>
             </w:r>
           </w:p>
         </w:tc>
         <w:tc>
           <w:tcPr>
             <w:tcW w:type="dxa" w:w="1550"/>
+            <w:vAlign w:val="center"/>
           </w:tcPr>
           <w:p>
             <w:pPr>
               <w:spacing w:before="0" w:after="0" w:line="240" w:lineRule="auto"/>
               <w:jc w:val="center"/>
             </w:pPr>
-            <w:r/>
             <w:r>
               <w:rPr>
-                <w:rFonts w:ascii="Times New Roman" w:hAnsi="Times New Roman" w:cs="Times New Roman" w:eastAsia="宋体" w:hint="eastAsia"/>
+                <w:rFonts w:ascii="Times New Roman" w:hAnsi="Times New Roman" w:eastAsia="宋体"/>
                 <w:b w:val="0"/>
                 <w:sz w:val="16"/>
-                <w:lang w:eastAsia="zh-CN"/>
               </w:rPr>
-              <w:t>目标 1.3，2.3，2.5，3.2</w:t>
+              <w:t>目标 1.4，1.5，2.4，3.1，3.3</w:t>
             </w:r>
           </w:p>
         </w:tc>
@@ -6994,40 +7035,38 @@
         <w:tc>
           <w:tcPr>
             <w:tcW w:type="dxa" w:w="1600"/>
+            <w:vAlign w:val="center"/>
           </w:tcPr>
           <w:p>
             <w:pPr>
               <w:spacing w:before="0" w:after="0" w:line="240" w:lineRule="auto"/>
               <w:jc w:val="left"/>
             </w:pPr>
-            <w:r/>
             <w:r>
               <w:rPr>
-                <w:rFonts w:ascii="Times New Roman" w:hAnsi="Times New Roman" w:cs="Times New Roman" w:eastAsia="宋体" w:hint="eastAsia"/>
+                <w:rFonts w:ascii="Times New Roman" w:hAnsi="Times New Roman" w:eastAsia="宋体"/>
                 <w:b w:val="0"/>
                 <w:sz w:val="16"/>
-                <w:lang w:eastAsia="zh-CN"/>
               </w:rPr>
-              <w:t>手册、标准与安全阅读</w:t>
+              <w:t>技术写作与图表表达</w:t>
             </w:r>
           </w:p>
         </w:tc>
         <w:tc>
           <w:tcPr>
             <w:tcW w:type="dxa" w:w="850"/>
+            <w:vAlign w:val="center"/>
           </w:tcPr>
           <w:p>
             <w:pPr>
               <w:spacing w:before="0" w:after="0" w:line="240" w:lineRule="auto"/>
               <w:jc w:val="center"/>
             </w:pPr>
-            <w:r/>
             <w:r>
               <w:rPr>
-                <w:rFonts w:ascii="Times New Roman" w:hAnsi="Times New Roman" w:cs="Times New Roman" w:eastAsia="宋体" w:hint="eastAsia"/>
+                <w:rFonts w:ascii="Times New Roman" w:hAnsi="Times New Roman" w:eastAsia="宋体"/>
                 <w:b w:val="0"/>
                 <w:sz w:val="16"/>
-                <w:lang w:eastAsia="zh-CN"/>
               </w:rPr>
               <w:t>15%</w:t>
             </w:r>
@@ -7036,42 +7075,40 @@
         <w:tc>
           <w:tcPr>
             <w:tcW w:type="dxa" w:w="5050"/>
+            <w:vAlign w:val="center"/>
           </w:tcPr>
           <w:p>
             <w:pPr>
               <w:spacing w:before="0" w:after="0" w:line="240" w:lineRule="auto"/>
               <w:jc w:val="left"/>
             </w:pPr>
-            <w:r/>
             <w:r>
               <w:rPr>
-                <w:rFonts w:ascii="Times New Roman" w:hAnsi="Times New Roman" w:cs="Times New Roman" w:eastAsia="宋体" w:hint="eastAsia"/>
+                <w:rFonts w:ascii="Times New Roman" w:hAnsi="Times New Roman" w:eastAsia="宋体"/>
                 <w:b w:val="0"/>
                 <w:sz w:val="16"/>
-                <w:lang w:eastAsia="zh-CN"/>
               </w:rPr>
-              <w:t>能够准确提取强制条款、警示等级、安装/操作条件和排故步骤，不弱化安全含义。</w:t>
+              <w:t>摘要、图表说明、技术简介、技术邮件或简短报告结构清楚，信息选择、逻辑、时态和格式符合技术交流要求。</w:t>
             </w:r>
           </w:p>
         </w:tc>
         <w:tc>
           <w:tcPr>
             <w:tcW w:type="dxa" w:w="1550"/>
+            <w:vAlign w:val="center"/>
           </w:tcPr>
           <w:p>
             <w:pPr>
               <w:spacing w:before="0" w:after="0" w:line="240" w:lineRule="auto"/>
               <w:jc w:val="center"/>
             </w:pPr>
-            <w:r/>
             <w:r>
               <w:rPr>
-                <w:rFonts w:ascii="Times New Roman" w:hAnsi="Times New Roman" w:cs="Times New Roman" w:eastAsia="宋体" w:hint="eastAsia"/>
+                <w:rFonts w:ascii="Times New Roman" w:hAnsi="Times New Roman" w:eastAsia="宋体"/>
                 <w:b w:val="0"/>
                 <w:sz w:val="16"/>
-                <w:lang w:eastAsia="zh-CN"/>
               </w:rPr>
-              <w:t>目标 1.4，2.4，3.3</w:t>
+              <w:t>目标 1.6，2.5，2.6，3.4，3.5</w:t>
             </w:r>
           </w:p>
         </w:tc>
@@ -7083,40 +7120,38 @@
         <w:tc>
           <w:tcPr>
             <w:tcW w:type="dxa" w:w="1600"/>
+            <w:vAlign w:val="center"/>
           </w:tcPr>
           <w:p>
             <w:pPr>
               <w:spacing w:before="0" w:after="0" w:line="240" w:lineRule="auto"/>
               <w:jc w:val="left"/>
             </w:pPr>
-            <w:r/>
             <w:r>
               <w:rPr>
-                <w:rFonts w:ascii="Times New Roman" w:hAnsi="Times New Roman" w:cs="Times New Roman" w:eastAsia="宋体" w:hint="eastAsia"/>
+                <w:rFonts w:ascii="Times New Roman" w:hAnsi="Times New Roman" w:eastAsia="宋体"/>
                 <w:b w:val="0"/>
                 <w:sz w:val="16"/>
-                <w:lang w:eastAsia="zh-CN"/>
               </w:rPr>
-              <w:t>文献检索与摘要阅读</w:t>
+              <w:t>AI辅助后编辑与过程记录</w:t>
             </w:r>
           </w:p>
         </w:tc>
         <w:tc>
           <w:tcPr>
             <w:tcW w:type="dxa" w:w="850"/>
+            <w:vAlign w:val="center"/>
           </w:tcPr>
           <w:p>
             <w:pPr>
               <w:spacing w:before="0" w:after="0" w:line="240" w:lineRule="auto"/>
               <w:jc w:val="center"/>
             </w:pPr>
-            <w:r/>
             <w:r>
               <w:rPr>
-                <w:rFonts w:ascii="Times New Roman" w:hAnsi="Times New Roman" w:cs="Times New Roman" w:eastAsia="宋体" w:hint="eastAsia"/>
+                <w:rFonts w:ascii="Times New Roman" w:hAnsi="Times New Roman" w:eastAsia="宋体"/>
                 <w:b w:val="0"/>
                 <w:sz w:val="16"/>
-                <w:lang w:eastAsia="zh-CN"/>
               </w:rPr>
               <w:t>10%</w:t>
             </w:r>
@@ -7125,42 +7160,40 @@
         <w:tc>
           <w:tcPr>
             <w:tcW w:type="dxa" w:w="5050"/>
+            <w:vAlign w:val="center"/>
           </w:tcPr>
           <w:p>
             <w:pPr>
               <w:spacing w:before="0" w:after="0" w:line="240" w:lineRule="auto"/>
               <w:jc w:val="left"/>
             </w:pPr>
-            <w:r/>
             <w:r>
               <w:rPr>
-                <w:rFonts w:ascii="Times New Roman" w:hAnsi="Times New Roman" w:cs="Times New Roman" w:eastAsia="宋体" w:hint="eastAsia"/>
+                <w:rFonts w:ascii="Times New Roman" w:hAnsi="Times New Roman" w:eastAsia="宋体"/>
                 <w:b w:val="0"/>
                 <w:sz w:val="16"/>
-                <w:lang w:eastAsia="zh-CN"/>
               </w:rPr>
-              <w:t>检索式、来源筛选、文献卡片和摘要结构分析完整，能够区分事实、结论和局限。</w:t>
+              <w:t>保留工具使用和修改记录，能够发现并修正术语、数字、单位、否定、逻辑和虚构来源错误，对终稿内容可独立解释。</w:t>
             </w:r>
           </w:p>
         </w:tc>
         <w:tc>
           <w:tcPr>
             <w:tcW w:type="dxa" w:w="1550"/>
+            <w:vAlign w:val="center"/>
           </w:tcPr>
           <w:p>
             <w:pPr>
               <w:spacing w:before="0" w:after="0" w:line="240" w:lineRule="auto"/>
               <w:jc w:val="center"/>
             </w:pPr>
-            <w:r/>
             <w:r>
               <w:rPr>
-                <w:rFonts w:ascii="Times New Roman" w:hAnsi="Times New Roman" w:cs="Times New Roman" w:eastAsia="宋体" w:hint="eastAsia"/>
+                <w:rFonts w:ascii="Times New Roman" w:hAnsi="Times New Roman" w:eastAsia="宋体"/>
                 <w:b w:val="0"/>
                 <w:sz w:val="16"/>
-                <w:lang w:eastAsia="zh-CN"/>
               </w:rPr>
-              <w:t>目标 1.5，2.5，3.4，3.6</w:t>
+              <w:t>目标 2.6，3.4，3.6</w:t>
             </w:r>
           </w:p>
         </w:tc>
@@ -7169,19 +7202,18 @@
         <w:tc>
           <w:tcPr>
             <w:tcW w:type="dxa" w:w="1600"/>
+            <w:vAlign w:val="center"/>
           </w:tcPr>
           <w:p>
             <w:pPr>
               <w:spacing w:before="0" w:after="0" w:line="240" w:lineRule="auto"/>
               <w:jc w:val="center"/>
             </w:pPr>
-            <w:r/>
             <w:r>
               <w:rPr>
-                <w:rFonts w:ascii="Times New Roman" w:hAnsi="Times New Roman" w:cs="Times New Roman" w:eastAsia="宋体" w:hint="eastAsia"/>
+                <w:rFonts w:ascii="Times New Roman" w:hAnsi="Times New Roman" w:eastAsia="宋体"/>
                 <w:b/>
                 <w:sz w:val="16"/>
-                <w:lang w:eastAsia="zh-CN"/>
               </w:rPr>
               <w:t>合计</w:t>
             </w:r>
@@ -7190,19 +7222,18 @@
         <w:tc>
           <w:tcPr>
             <w:tcW w:type="dxa" w:w="850"/>
+            <w:vAlign w:val="center"/>
           </w:tcPr>
           <w:p>
             <w:pPr>
               <w:spacing w:before="0" w:after="0" w:line="240" w:lineRule="auto"/>
               <w:jc w:val="center"/>
             </w:pPr>
-            <w:r/>
             <w:r>
               <w:rPr>
-                <w:rFonts w:ascii="Times New Roman" w:hAnsi="Times New Roman" w:cs="Times New Roman" w:eastAsia="宋体" w:hint="eastAsia"/>
+                <w:rFonts w:ascii="Times New Roman" w:hAnsi="Times New Roman" w:eastAsia="宋体"/>
                 <w:b/>
                 <w:sz w:val="16"/>
-                <w:lang w:eastAsia="zh-CN"/>
               </w:rPr>
               <w:t>100%</w:t>
             </w:r>
@@ -7211,19 +7242,18 @@
         <w:tc>
           <w:tcPr>
             <w:tcW w:type="dxa" w:w="5050"/>
+            <w:vAlign w:val="center"/>
           </w:tcPr>
           <w:p>
             <w:pPr>
               <w:spacing w:before="0" w:after="0" w:line="240" w:lineRule="auto"/>
               <w:jc w:val="center"/>
             </w:pPr>
-            <w:r/>
             <w:r>
               <w:rPr>
-                <w:rFonts w:ascii="Times New Roman" w:hAnsi="Times New Roman" w:cs="Times New Roman" w:eastAsia="宋体" w:hint="eastAsia"/>
+                <w:rFonts w:ascii="Times New Roman" w:hAnsi="Times New Roman" w:eastAsia="宋体"/>
                 <w:b/>
                 <w:sz w:val="16"/>
-                <w:lang w:eastAsia="zh-CN"/>
               </w:rPr>
             </w:r>
           </w:p>
@@ -7231,39 +7261,38 @@
         <w:tc>
           <w:tcPr>
             <w:tcW w:type="dxa" w:w="1550"/>
+            <w:vAlign w:val="center"/>
           </w:tcPr>
           <w:p>
             <w:pPr>
               <w:spacing w:before="0" w:after="0" w:line="240" w:lineRule="auto"/>
               <w:jc w:val="center"/>
             </w:pPr>
-            <w:r/>
             <w:r>
               <w:rPr>
-                <w:rFonts w:ascii="Times New Roman" w:hAnsi="Times New Roman" w:cs="Times New Roman" w:eastAsia="宋体" w:hint="eastAsia"/>
+                <w:rFonts w:ascii="Times New Roman" w:hAnsi="Times New Roman" w:eastAsia="宋体"/>
                 <w:b/>
                 <w:sz w:val="16"/>
-                <w:lang w:eastAsia="zh-CN"/>
               </w:rPr>
             </w:r>
           </w:p>
         </w:tc>
       </w:tr>
     </w:tbl>
+    <w:p/>
     <w:p/>
     <w:p>
       <w:pPr>
         <w:keepNext/>
-        <w:spacing w:before="80" w:after="40"/>
+        <w:spacing w:before="0" w:after="0" w:line="276" w:lineRule="auto"/>
       </w:pPr>
       <w:r>
         <w:rPr>
-          <w:rFonts w:ascii="Times New Roman" w:hAnsi="Times New Roman" w:cs="Times New Roman" w:eastAsia="宋体" w:hint="eastAsia"/>
+          <w:rFonts w:ascii="Times New Roman" w:hAnsi="Times New Roman" w:eastAsia="宋体"/>
           <w:b/>
           <w:sz w:val="24"/>
-          <w:lang w:eastAsia="zh-CN"/>
         </w:rPr>
-        <w:t>（3）翻译与技术写作任务评分标准</w:t>
+        <w:t>（3）期末考核评分标准</w:t>
       </w:r>
     </w:p>
     <w:tbl>
@@ -7307,13 +7336,11 @@
               <w:spacing w:before="0" w:after="0" w:line="240" w:lineRule="auto"/>
               <w:jc w:val="center"/>
             </w:pPr>
-            <w:r/>
             <w:r>
               <w:rPr>
-                <w:rFonts w:ascii="Times New Roman" w:hAnsi="Times New Roman" w:cs="Times New Roman" w:eastAsia="宋体" w:hint="eastAsia"/>
+                <w:rFonts w:ascii="Times New Roman" w:hAnsi="Times New Roman" w:eastAsia="宋体"/>
                 <w:b/>
                 <w:sz w:val="16"/>
-                <w:lang w:eastAsia="zh-CN"/>
               </w:rPr>
               <w:t>考核内容</w:t>
             </w:r>
@@ -7335,13 +7362,11 @@
               <w:spacing w:before="0" w:after="0" w:line="240" w:lineRule="auto"/>
               <w:jc w:val="center"/>
             </w:pPr>
-            <w:r/>
             <w:r>
               <w:rPr>
-                <w:rFonts w:ascii="Times New Roman" w:hAnsi="Times New Roman" w:cs="Times New Roman" w:eastAsia="宋体" w:hint="eastAsia"/>
+                <w:rFonts w:ascii="Times New Roman" w:hAnsi="Times New Roman" w:eastAsia="宋体"/>
                 <w:b/>
                 <w:sz w:val="16"/>
-                <w:lang w:eastAsia="zh-CN"/>
               </w:rPr>
               <w:t>成绩占比</w:t>
             </w:r>
@@ -7363,13 +7388,11 @@
               <w:spacing w:before="0" w:after="0" w:line="240" w:lineRule="auto"/>
               <w:jc w:val="center"/>
             </w:pPr>
-            <w:r/>
             <w:r>
               <w:rPr>
-                <w:rFonts w:ascii="Times New Roman" w:hAnsi="Times New Roman" w:cs="Times New Roman" w:eastAsia="宋体" w:hint="eastAsia"/>
+                <w:rFonts w:ascii="Times New Roman" w:hAnsi="Times New Roman" w:eastAsia="宋体"/>
                 <w:b/>
                 <w:sz w:val="16"/>
-                <w:lang w:eastAsia="zh-CN"/>
               </w:rPr>
               <w:t>考核目标与评分要求</w:t>
             </w:r>
@@ -7391,13 +7414,11 @@
               <w:spacing w:before="0" w:after="0" w:line="240" w:lineRule="auto"/>
               <w:jc w:val="center"/>
             </w:pPr>
-            <w:r/>
             <w:r>
               <w:rPr>
-                <w:rFonts w:ascii="Times New Roman" w:hAnsi="Times New Roman" w:cs="Times New Roman" w:eastAsia="宋体" w:hint="eastAsia"/>
+                <w:rFonts w:ascii="Times New Roman" w:hAnsi="Times New Roman" w:eastAsia="宋体"/>
                 <w:b/>
                 <w:sz w:val="16"/>
-                <w:lang w:eastAsia="zh-CN"/>
               </w:rPr>
               <w:t>课程目标</w:t>
             </w:r>
@@ -7411,84 +7432,80 @@
         <w:tc>
           <w:tcPr>
             <w:tcW w:type="dxa" w:w="1600"/>
+            <w:vAlign w:val="center"/>
           </w:tcPr>
           <w:p>
             <w:pPr>
               <w:spacing w:before="0" w:after="0" w:line="240" w:lineRule="auto"/>
               <w:jc w:val="left"/>
             </w:pPr>
-            <w:r/>
             <w:r>
               <w:rPr>
-                <w:rFonts w:ascii="Times New Roman" w:hAnsi="Times New Roman" w:cs="Times New Roman" w:eastAsia="宋体" w:hint="eastAsia"/>
+                <w:rFonts w:ascii="Times New Roman" w:hAnsi="Times New Roman" w:eastAsia="宋体"/>
                 <w:b w:val="0"/>
                 <w:sz w:val="16"/>
-                <w:lang w:eastAsia="zh-CN"/>
               </w:rPr>
-              <w:t>术语一致与句法处理</w:t>
+              <w:t>主题与可靠来源</w:t>
             </w:r>
           </w:p>
         </w:tc>
         <w:tc>
           <w:tcPr>
             <w:tcW w:type="dxa" w:w="850"/>
+            <w:vAlign w:val="center"/>
           </w:tcPr>
           <w:p>
             <w:pPr>
               <w:spacing w:before="0" w:after="0" w:line="240" w:lineRule="auto"/>
               <w:jc w:val="center"/>
             </w:pPr>
-            <w:r/>
             <w:r>
               <w:rPr>
-                <w:rFonts w:ascii="Times New Roman" w:hAnsi="Times New Roman" w:cs="Times New Roman" w:eastAsia="宋体" w:hint="eastAsia"/>
+                <w:rFonts w:ascii="Times New Roman" w:hAnsi="Times New Roman" w:eastAsia="宋体"/>
                 <w:b w:val="0"/>
                 <w:sz w:val="16"/>
-                <w:lang w:eastAsia="zh-CN"/>
               </w:rPr>
-              <w:t>15%</w:t>
+              <w:t>10%</w:t>
             </w:r>
           </w:p>
         </w:tc>
         <w:tc>
           <w:tcPr>
             <w:tcW w:type="dxa" w:w="5050"/>
+            <w:vAlign w:val="center"/>
           </w:tcPr>
           <w:p>
             <w:pPr>
               <w:spacing w:before="0" w:after="0" w:line="240" w:lineRule="auto"/>
               <w:jc w:val="left"/>
             </w:pPr>
-            <w:r/>
             <w:r>
               <w:rPr>
-                <w:rFonts w:ascii="Times New Roman" w:hAnsi="Times New Roman" w:cs="Times New Roman" w:eastAsia="宋体" w:hint="eastAsia"/>
+                <w:rFonts w:ascii="Times New Roman" w:hAnsi="Times New Roman" w:eastAsia="宋体"/>
                 <w:b w:val="0"/>
                 <w:sz w:val="16"/>
-                <w:lang w:eastAsia="zh-CN"/>
               </w:rPr>
-              <w:t>译文术语、缩略语、数字、单位和逻辑关系准确，长难句拆分与重组合理。</w:t>
+              <w:t>选择数控、机器人、增材制造、数字孪生、智能产线或预测性维护等主题，中英文来源真实、相关且版本清楚。</w:t>
             </w:r>
           </w:p>
         </w:tc>
         <w:tc>
           <w:tcPr>
             <w:tcW w:type="dxa" w:w="1550"/>
+            <w:vAlign w:val="center"/>
           </w:tcPr>
           <w:p>
             <w:pPr>
               <w:spacing w:before="0" w:after="0" w:line="240" w:lineRule="auto"/>
               <w:jc w:val="center"/>
             </w:pPr>
-            <w:r/>
             <w:r>
               <w:rPr>
-                <w:rFonts w:ascii="Times New Roman" w:hAnsi="Times New Roman" w:cs="Times New Roman" w:eastAsia="宋体" w:hint="eastAsia"/>
+                <w:rFonts w:ascii="Times New Roman" w:hAnsi="Times New Roman" w:eastAsia="宋体"/>
                 <w:b w:val="0"/>
                 <w:sz w:val="16"/>
-                <w:lang w:eastAsia="zh-CN"/>
               </w:rPr>
-              <w:t>目标 1.1，1.5，2.2，3.1</w:t>
+              <w:t>目标 2.5，3.4，3.6</w:t>
             </w:r>
           </w:p>
         </w:tc>
@@ -7500,84 +7517,80 @@
         <w:tc>
           <w:tcPr>
             <w:tcW w:type="dxa" w:w="1600"/>
+            <w:vAlign w:val="center"/>
           </w:tcPr>
           <w:p>
             <w:pPr>
               <w:spacing w:before="0" w:after="0" w:line="240" w:lineRule="auto"/>
               <w:jc w:val="left"/>
             </w:pPr>
-            <w:r/>
             <w:r>
               <w:rPr>
-                <w:rFonts w:ascii="Times New Roman" w:hAnsi="Times New Roman" w:cs="Times New Roman" w:eastAsia="宋体" w:hint="eastAsia"/>
+                <w:rFonts w:ascii="Times New Roman" w:hAnsi="Times New Roman" w:eastAsia="宋体"/>
                 <w:b w:val="0"/>
                 <w:sz w:val="16"/>
-                <w:lang w:eastAsia="zh-CN"/>
               </w:rPr>
-              <w:t>机械/装备技术翻译</w:t>
+              <w:t>双语术语与阅读证据</w:t>
             </w:r>
           </w:p>
         </w:tc>
         <w:tc>
           <w:tcPr>
             <w:tcW w:type="dxa" w:w="850"/>
+            <w:vAlign w:val="center"/>
           </w:tcPr>
           <w:p>
             <w:pPr>
               <w:spacing w:before="0" w:after="0" w:line="240" w:lineRule="auto"/>
               <w:jc w:val="center"/>
             </w:pPr>
-            <w:r/>
             <w:r>
               <w:rPr>
-                <w:rFonts w:ascii="Times New Roman" w:hAnsi="Times New Roman" w:cs="Times New Roman" w:eastAsia="宋体" w:hint="eastAsia"/>
+                <w:rFonts w:ascii="Times New Roman" w:hAnsi="Times New Roman" w:eastAsia="宋体"/>
                 <w:b w:val="0"/>
                 <w:sz w:val="16"/>
-                <w:lang w:eastAsia="zh-CN"/>
               </w:rPr>
-              <w:t>20%</w:t>
+              <w:t>15%</w:t>
             </w:r>
           </w:p>
         </w:tc>
         <w:tc>
           <w:tcPr>
             <w:tcW w:type="dxa" w:w="5050"/>
+            <w:vAlign w:val="center"/>
           </w:tcPr>
           <w:p>
             <w:pPr>
               <w:spacing w:before="0" w:after="0" w:line="240" w:lineRule="auto"/>
               <w:jc w:val="left"/>
             </w:pPr>
-            <w:r/>
             <w:r>
               <w:rPr>
-                <w:rFonts w:ascii="Times New Roman" w:hAnsi="Times New Roman" w:cs="Times New Roman" w:eastAsia="宋体" w:hint="eastAsia"/>
+                <w:rFonts w:ascii="Times New Roman" w:hAnsi="Times New Roman" w:eastAsia="宋体"/>
                 <w:b w:val="0"/>
                 <w:sz w:val="16"/>
-                <w:lang w:eastAsia="zh-CN"/>
               </w:rPr>
-              <w:t>能够准确翻译部件、性能、工艺与系统关系，中文/英文表达符合工程语体。</w:t>
+              <w:t>术语表一致，定义和语境准确；关键事实、参数和结论能够定位到原文或图表。</w:t>
             </w:r>
           </w:p>
         </w:tc>
         <w:tc>
           <w:tcPr>
             <w:tcW w:type="dxa" w:w="1550"/>
+            <w:vAlign w:val="center"/>
           </w:tcPr>
           <w:p>
             <w:pPr>
               <w:spacing w:before="0" w:after="0" w:line="240" w:lineRule="auto"/>
               <w:jc w:val="center"/>
             </w:pPr>
-            <w:r/>
             <w:r>
               <w:rPr>
-                <w:rFonts w:ascii="Times New Roman" w:hAnsi="Times New Roman" w:cs="Times New Roman" w:eastAsia="宋体" w:hint="eastAsia"/>
+                <w:rFonts w:ascii="Times New Roman" w:hAnsi="Times New Roman" w:eastAsia="宋体"/>
                 <w:b w:val="0"/>
                 <w:sz w:val="16"/>
-                <w:lang w:eastAsia="zh-CN"/>
               </w:rPr>
-              <w:t>目标 1.2，1.3，2.3，3.2</w:t>
+              <w:t>目标 1.1—1.4，2.1，2.2，3.1，3.2</w:t>
             </w:r>
           </w:p>
         </w:tc>
@@ -7589,40 +7602,38 @@
         <w:tc>
           <w:tcPr>
             <w:tcW w:type="dxa" w:w="1600"/>
+            <w:vAlign w:val="center"/>
           </w:tcPr>
           <w:p>
             <w:pPr>
               <w:spacing w:before="0" w:after="0" w:line="240" w:lineRule="auto"/>
               <w:jc w:val="left"/>
             </w:pPr>
-            <w:r/>
             <w:r>
               <w:rPr>
-                <w:rFonts w:ascii="Times New Roman" w:hAnsi="Times New Roman" w:cs="Times New Roman" w:eastAsia="宋体" w:hint="eastAsia"/>
+                <w:rFonts w:ascii="Times New Roman" w:hAnsi="Times New Roman" w:eastAsia="宋体"/>
                 <w:b w:val="0"/>
                 <w:sz w:val="16"/>
-                <w:lang w:eastAsia="zh-CN"/>
               </w:rPr>
-              <w:t>手册、标准与排故写作</w:t>
+              <w:t>技术系统或过程说明</w:t>
             </w:r>
           </w:p>
         </w:tc>
         <w:tc>
           <w:tcPr>
             <w:tcW w:type="dxa" w:w="850"/>
+            <w:vAlign w:val="center"/>
           </w:tcPr>
           <w:p>
             <w:pPr>
               <w:spacing w:before="0" w:after="0" w:line="240" w:lineRule="auto"/>
               <w:jc w:val="center"/>
             </w:pPr>
-            <w:r/>
             <w:r>
               <w:rPr>
-                <w:rFonts w:ascii="Times New Roman" w:hAnsi="Times New Roman" w:cs="Times New Roman" w:eastAsia="宋体" w:hint="eastAsia"/>
+                <w:rFonts w:ascii="Times New Roman" w:hAnsi="Times New Roman" w:eastAsia="宋体"/>
                 <w:b w:val="0"/>
                 <w:sz w:val="16"/>
-                <w:lang w:eastAsia="zh-CN"/>
               </w:rPr>
               <w:t>20%</w:t>
             </w:r>
@@ -7631,42 +7642,40 @@
         <w:tc>
           <w:tcPr>
             <w:tcW w:type="dxa" w:w="5050"/>
+            <w:vAlign w:val="center"/>
           </w:tcPr>
           <w:p>
             <w:pPr>
               <w:spacing w:before="0" w:after="0" w:line="240" w:lineRule="auto"/>
               <w:jc w:val="left"/>
             </w:pPr>
-            <w:r/>
             <w:r>
               <w:rPr>
-                <w:rFonts w:ascii="Times New Roman" w:hAnsi="Times New Roman" w:cs="Times New Roman" w:eastAsia="宋体" w:hint="eastAsia"/>
+                <w:rFonts w:ascii="Times New Roman" w:hAnsi="Times New Roman" w:eastAsia="宋体"/>
                 <w:b w:val="0"/>
                 <w:sz w:val="16"/>
-                <w:lang w:eastAsia="zh-CN"/>
               </w:rPr>
-              <w:t>操作卡、故障记录或安全说明结构清楚，条件、步骤、警示和责任边界准确。</w:t>
+              <w:t>能够用英文或中英双语说明对象、组成、工作过程、接口、性能、问题与改进，系统关系清楚且技术事实准确。</w:t>
             </w:r>
           </w:p>
         </w:tc>
         <w:tc>
           <w:tcPr>
             <w:tcW w:type="dxa" w:w="1550"/>
+            <w:vAlign w:val="center"/>
           </w:tcPr>
           <w:p>
             <w:pPr>
               <w:spacing w:before="0" w:after="0" w:line="240" w:lineRule="auto"/>
               <w:jc w:val="center"/>
             </w:pPr>
-            <w:r/>
             <w:r>
               <w:rPr>
-                <w:rFonts w:ascii="Times New Roman" w:hAnsi="Times New Roman" w:cs="Times New Roman" w:eastAsia="宋体" w:hint="eastAsia"/>
+                <w:rFonts w:ascii="Times New Roman" w:hAnsi="Times New Roman" w:eastAsia="宋体"/>
                 <w:b w:val="0"/>
                 <w:sz w:val="16"/>
-                <w:lang w:eastAsia="zh-CN"/>
               </w:rPr>
-              <w:t>目标 1.4，2.4，3.3</w:t>
+              <w:t>目标 1.2—1.4，2.3，2.4，3.2</w:t>
             </w:r>
           </w:p>
         </w:tc>
@@ -7678,40 +7687,38 @@
         <w:tc>
           <w:tcPr>
             <w:tcW w:type="dxa" w:w="1600"/>
+            <w:vAlign w:val="center"/>
           </w:tcPr>
           <w:p>
             <w:pPr>
               <w:spacing w:before="0" w:after="0" w:line="240" w:lineRule="auto"/>
               <w:jc w:val="left"/>
             </w:pPr>
-            <w:r/>
             <w:r>
               <w:rPr>
-                <w:rFonts w:ascii="Times New Roman" w:hAnsi="Times New Roman" w:cs="Times New Roman" w:eastAsia="宋体" w:hint="eastAsia"/>
+                <w:rFonts w:ascii="Times New Roman" w:hAnsi="Times New Roman" w:eastAsia="宋体"/>
                 <w:b w:val="0"/>
                 <w:sz w:val="16"/>
-                <w:lang w:eastAsia="zh-CN"/>
               </w:rPr>
-              <w:t>摘要、图表与技术报告</w:t>
+              <w:t>技术文档与翻译质量</w:t>
             </w:r>
           </w:p>
         </w:tc>
         <w:tc>
           <w:tcPr>
             <w:tcW w:type="dxa" w:w="850"/>
+            <w:vAlign w:val="center"/>
           </w:tcPr>
           <w:p>
             <w:pPr>
               <w:spacing w:before="0" w:after="0" w:line="240" w:lineRule="auto"/>
               <w:jc w:val="center"/>
             </w:pPr>
-            <w:r/>
             <w:r>
               <w:rPr>
-                <w:rFonts w:ascii="Times New Roman" w:hAnsi="Times New Roman" w:cs="Times New Roman" w:eastAsia="宋体" w:hint="eastAsia"/>
+                <w:rFonts w:ascii="Times New Roman" w:hAnsi="Times New Roman" w:eastAsia="宋体"/>
                 <w:b w:val="0"/>
                 <w:sz w:val="16"/>
-                <w:lang w:eastAsia="zh-CN"/>
               </w:rPr>
               <w:t>20%</w:t>
             </w:r>
@@ -7720,42 +7727,40 @@
         <w:tc>
           <w:tcPr>
             <w:tcW w:type="dxa" w:w="5050"/>
+            <w:vAlign w:val="center"/>
           </w:tcPr>
           <w:p>
             <w:pPr>
               <w:spacing w:before="0" w:after="0" w:line="240" w:lineRule="auto"/>
               <w:jc w:val="left"/>
             </w:pPr>
-            <w:r/>
             <w:r>
               <w:rPr>
-                <w:rFonts w:ascii="Times New Roman" w:hAnsi="Times New Roman" w:cs="Times New Roman" w:eastAsia="宋体" w:hint="eastAsia"/>
+                <w:rFonts w:ascii="Times New Roman" w:hAnsi="Times New Roman" w:eastAsia="宋体"/>
                 <w:b w:val="0"/>
                 <w:sz w:val="16"/>
-                <w:lang w:eastAsia="zh-CN"/>
               </w:rPr>
-              <w:t>标题、摘要、关键词、图表说明或技术简介完整，信息选择、时态和逻辑组织合理。</w:t>
+              <w:t>技术简介、摘要、图表说明、操作/安全/排故片段等成果结构规范，翻译和写作准确、简洁、一致。</w:t>
             </w:r>
           </w:p>
         </w:tc>
         <w:tc>
           <w:tcPr>
             <w:tcW w:type="dxa" w:w="1550"/>
+            <w:vAlign w:val="center"/>
           </w:tcPr>
           <w:p>
             <w:pPr>
               <w:spacing w:before="0" w:after="0" w:line="240" w:lineRule="auto"/>
               <w:jc w:val="center"/>
             </w:pPr>
-            <w:r/>
             <w:r>
               <w:rPr>
-                <w:rFonts w:ascii="Times New Roman" w:hAnsi="Times New Roman" w:cs="Times New Roman" w:eastAsia="宋体" w:hint="eastAsia"/>
+                <w:rFonts w:ascii="Times New Roman" w:hAnsi="Times New Roman" w:eastAsia="宋体"/>
                 <w:b w:val="0"/>
                 <w:sz w:val="16"/>
-                <w:lang w:eastAsia="zh-CN"/>
               </w:rPr>
-              <w:t>目标 1.6，2.5，3.4</w:t>
+              <w:t>目标 1.5，1.6，2.4—2.6，3.3，3.4</w:t>
             </w:r>
           </w:p>
         </w:tc>
@@ -7767,84 +7772,80 @@
         <w:tc>
           <w:tcPr>
             <w:tcW w:type="dxa" w:w="1600"/>
+            <w:vAlign w:val="center"/>
           </w:tcPr>
           <w:p>
             <w:pPr>
               <w:spacing w:before="0" w:after="0" w:line="240" w:lineRule="auto"/>
               <w:jc w:val="left"/>
             </w:pPr>
-            <w:r/>
             <w:r>
               <w:rPr>
-                <w:rFonts w:ascii="Times New Roman" w:hAnsi="Times New Roman" w:cs="Times New Roman" w:eastAsia="宋体" w:hint="eastAsia"/>
+                <w:rFonts w:ascii="Times New Roman" w:hAnsi="Times New Roman" w:eastAsia="宋体"/>
                 <w:b w:val="0"/>
                 <w:sz w:val="16"/>
-                <w:lang w:eastAsia="zh-CN"/>
               </w:rPr>
-              <w:t>技术邮件与跨文化表达</w:t>
+              <w:t>英文或双语汇报与问答</w:t>
             </w:r>
           </w:p>
         </w:tc>
         <w:tc>
           <w:tcPr>
             <w:tcW w:type="dxa" w:w="850"/>
+            <w:vAlign w:val="center"/>
           </w:tcPr>
           <w:p>
             <w:pPr>
               <w:spacing w:before="0" w:after="0" w:line="240" w:lineRule="auto"/>
               <w:jc w:val="center"/>
             </w:pPr>
-            <w:r/>
             <w:r>
               <w:rPr>
-                <w:rFonts w:ascii="Times New Roman" w:hAnsi="Times New Roman" w:cs="Times New Roman" w:eastAsia="宋体" w:hint="eastAsia"/>
+                <w:rFonts w:ascii="Times New Roman" w:hAnsi="Times New Roman" w:eastAsia="宋体"/>
                 <w:b w:val="0"/>
                 <w:sz w:val="16"/>
-                <w:lang w:eastAsia="zh-CN"/>
               </w:rPr>
-              <w:t>10%</w:t>
+              <w:t>25%</w:t>
             </w:r>
           </w:p>
         </w:tc>
         <w:tc>
           <w:tcPr>
             <w:tcW w:type="dxa" w:w="5050"/>
+            <w:vAlign w:val="center"/>
           </w:tcPr>
           <w:p>
             <w:pPr>
               <w:spacing w:before="0" w:after="0" w:line="240" w:lineRule="auto"/>
               <w:jc w:val="left"/>
             </w:pPr>
-            <w:r/>
             <w:r>
               <w:rPr>
-                <w:rFonts w:ascii="Times New Roman" w:hAnsi="Times New Roman" w:cs="Times New Roman" w:eastAsia="宋体" w:hint="eastAsia"/>
+                <w:rFonts w:ascii="Times New Roman" w:hAnsi="Times New Roman" w:eastAsia="宋体"/>
                 <w:b w:val="0"/>
                 <w:sz w:val="16"/>
-                <w:lang w:eastAsia="zh-CN"/>
               </w:rPr>
-              <w:t>主题、背景、问题、请求和附件说明明确，语气专业礼貌，能够有效澄清问题。</w:t>
+              <w:t>演示结构清楚，图表有效，表达可理解；能够回答技术问题、澄清信息、说明依据和局限。</w:t>
             </w:r>
           </w:p>
         </w:tc>
         <w:tc>
           <w:tcPr>
             <w:tcW w:type="dxa" w:w="1550"/>
+            <w:vAlign w:val="center"/>
           </w:tcPr>
           <w:p>
             <w:pPr>
               <w:spacing w:before="0" w:after="0" w:line="240" w:lineRule="auto"/>
               <w:jc w:val="center"/>
             </w:pPr>
-            <w:r/>
             <w:r>
               <w:rPr>
-                <w:rFonts w:ascii="Times New Roman" w:hAnsi="Times New Roman" w:cs="Times New Roman" w:eastAsia="宋体" w:hint="eastAsia"/>
+                <w:rFonts w:ascii="Times New Roman" w:hAnsi="Times New Roman" w:eastAsia="宋体"/>
                 <w:b w:val="0"/>
                 <w:sz w:val="16"/>
-                <w:lang w:eastAsia="zh-CN"/>
               </w:rPr>
-              <w:t>目标 1.6，2.6，3.5</w:t>
+              <w:t>目标 2.6，3.5，3.6</w:t>
             </w:r>
           </w:p>
         </w:tc>
@@ -7856,84 +7857,80 @@
         <w:tc>
           <w:tcPr>
             <w:tcW w:type="dxa" w:w="1600"/>
+            <w:vAlign w:val="center"/>
           </w:tcPr>
           <w:p>
             <w:pPr>
               <w:spacing w:before="0" w:after="0" w:line="240" w:lineRule="auto"/>
               <w:jc w:val="left"/>
             </w:pPr>
-            <w:r/>
             <w:r>
               <w:rPr>
-                <w:rFonts w:ascii="Times New Roman" w:hAnsi="Times New Roman" w:cs="Times New Roman" w:eastAsia="宋体" w:hint="eastAsia"/>
+                <w:rFonts w:ascii="Times New Roman" w:hAnsi="Times New Roman" w:eastAsia="宋体"/>
                 <w:b w:val="0"/>
                 <w:sz w:val="16"/>
-                <w:lang w:eastAsia="zh-CN"/>
               </w:rPr>
-              <w:t>AI辅助后编辑与核验</w:t>
+              <w:t>个人核验、版本与诚信</w:t>
             </w:r>
           </w:p>
         </w:tc>
         <w:tc>
           <w:tcPr>
             <w:tcW w:type="dxa" w:w="850"/>
+            <w:vAlign w:val="center"/>
           </w:tcPr>
           <w:p>
             <w:pPr>
               <w:spacing w:before="0" w:after="0" w:line="240" w:lineRule="auto"/>
               <w:jc w:val="center"/>
             </w:pPr>
-            <w:r/>
             <w:r>
               <w:rPr>
-                <w:rFonts w:ascii="Times New Roman" w:hAnsi="Times New Roman" w:cs="Times New Roman" w:eastAsia="宋体" w:hint="eastAsia"/>
+                <w:rFonts w:ascii="Times New Roman" w:hAnsi="Times New Roman" w:eastAsia="宋体"/>
                 <w:b w:val="0"/>
                 <w:sz w:val="16"/>
-                <w:lang w:eastAsia="zh-CN"/>
               </w:rPr>
-              <w:t>15%</w:t>
+              <w:t>10%</w:t>
             </w:r>
           </w:p>
         </w:tc>
         <w:tc>
           <w:tcPr>
             <w:tcW w:type="dxa" w:w="5050"/>
+            <w:vAlign w:val="center"/>
           </w:tcPr>
           <w:p>
             <w:pPr>
               <w:spacing w:before="0" w:after="0" w:line="240" w:lineRule="auto"/>
               <w:jc w:val="left"/>
             </w:pPr>
-            <w:r/>
             <w:r>
               <w:rPr>
-                <w:rFonts w:ascii="Times New Roman" w:hAnsi="Times New Roman" w:cs="Times New Roman" w:eastAsia="宋体" w:hint="eastAsia"/>
+                <w:rFonts w:ascii="Times New Roman" w:hAnsi="Times New Roman" w:eastAsia="宋体"/>
                 <w:b w:val="0"/>
                 <w:sz w:val="16"/>
-                <w:lang w:eastAsia="zh-CN"/>
               </w:rPr>
-              <w:t>保留工具使用记录，能够发现并修正术语、数字、否定、逻辑和虚构来源错误，终稿责任明确。</w:t>
+              <w:t>分工、版本、引用和工具/AI使用记录完整，个人能够解释并现场核验本人负责内容，团队成果与个人贡献一致。</w:t>
             </w:r>
           </w:p>
         </w:tc>
         <w:tc>
           <w:tcPr>
             <w:tcW w:type="dxa" w:w="1550"/>
+            <w:vAlign w:val="center"/>
           </w:tcPr>
           <w:p>
             <w:pPr>
               <w:spacing w:before="0" w:after="0" w:line="240" w:lineRule="auto"/>
               <w:jc w:val="center"/>
             </w:pPr>
-            <w:r/>
             <w:r>
               <w:rPr>
-                <w:rFonts w:ascii="Times New Roman" w:hAnsi="Times New Roman" w:cs="Times New Roman" w:eastAsia="宋体" w:hint="eastAsia"/>
+                <w:rFonts w:ascii="Times New Roman" w:hAnsi="Times New Roman" w:eastAsia="宋体"/>
                 <w:b w:val="0"/>
                 <w:sz w:val="16"/>
-                <w:lang w:eastAsia="zh-CN"/>
               </w:rPr>
-              <w:t>目标 2.6，3.4，3.6</w:t>
+              <w:t>目标 3.4，3.5，3.6</w:t>
             </w:r>
           </w:p>
         </w:tc>
@@ -7942,19 +7939,18 @@
         <w:tc>
           <w:tcPr>
             <w:tcW w:type="dxa" w:w="1600"/>
+            <w:vAlign w:val="center"/>
           </w:tcPr>
           <w:p>
             <w:pPr>
               <w:spacing w:before="0" w:after="0" w:line="240" w:lineRule="auto"/>
               <w:jc w:val="center"/>
             </w:pPr>
-            <w:r/>
             <w:r>
               <w:rPr>
-                <w:rFonts w:ascii="Times New Roman" w:hAnsi="Times New Roman" w:cs="Times New Roman" w:eastAsia="宋体" w:hint="eastAsia"/>
+                <w:rFonts w:ascii="Times New Roman" w:hAnsi="Times New Roman" w:eastAsia="宋体"/>
                 <w:b/>
                 <w:sz w:val="16"/>
-                <w:lang w:eastAsia="zh-CN"/>
               </w:rPr>
               <w:t>合计</w:t>
             </w:r>
@@ -7963,19 +7959,18 @@
         <w:tc>
           <w:tcPr>
             <w:tcW w:type="dxa" w:w="850"/>
+            <w:vAlign w:val="center"/>
           </w:tcPr>
           <w:p>
             <w:pPr>
               <w:spacing w:before="0" w:after="0" w:line="240" w:lineRule="auto"/>
               <w:jc w:val="center"/>
             </w:pPr>
-            <w:r/>
             <w:r>
               <w:rPr>
-                <w:rFonts w:ascii="Times New Roman" w:hAnsi="Times New Roman" w:cs="Times New Roman" w:eastAsia="宋体" w:hint="eastAsia"/>
+                <w:rFonts w:ascii="Times New Roman" w:hAnsi="Times New Roman" w:eastAsia="宋体"/>
                 <w:b/>
                 <w:sz w:val="16"/>
-                <w:lang w:eastAsia="zh-CN"/>
               </w:rPr>
               <w:t>100%</w:t>
             </w:r>
@@ -7984,19 +7979,18 @@
         <w:tc>
           <w:tcPr>
             <w:tcW w:type="dxa" w:w="5050"/>
+            <w:vAlign w:val="center"/>
           </w:tcPr>
           <w:p>
             <w:pPr>
               <w:spacing w:before="0" w:after="0" w:line="240" w:lineRule="auto"/>
               <w:jc w:val="center"/>
             </w:pPr>
-            <w:r/>
             <w:r>
               <w:rPr>
-                <w:rFonts w:ascii="Times New Roman" w:hAnsi="Times New Roman" w:cs="Times New Roman" w:eastAsia="宋体" w:hint="eastAsia"/>
+                <w:rFonts w:ascii="Times New Roman" w:hAnsi="Times New Roman" w:eastAsia="宋体"/>
                 <w:b/>
                 <w:sz w:val="16"/>
-                <w:lang w:eastAsia="zh-CN"/>
               </w:rPr>
             </w:r>
           </w:p>
@@ -8004,799 +7998,37 @@
         <w:tc>
           <w:tcPr>
             <w:tcW w:type="dxa" w:w="1550"/>
+            <w:vAlign w:val="center"/>
           </w:tcPr>
           <w:p>
             <w:pPr>
               <w:spacing w:before="0" w:after="0" w:line="240" w:lineRule="auto"/>
               <w:jc w:val="center"/>
             </w:pPr>
-            <w:r/>
             <w:r>
               <w:rPr>
-                <w:rFonts w:ascii="Times New Roman" w:hAnsi="Times New Roman" w:cs="Times New Roman" w:eastAsia="宋体" w:hint="eastAsia"/>
+                <w:rFonts w:ascii="Times New Roman" w:hAnsi="Times New Roman" w:eastAsia="宋体"/>
                 <w:b/>
                 <w:sz w:val="16"/>
-                <w:lang w:eastAsia="zh-CN"/>
               </w:rPr>
             </w:r>
           </w:p>
         </w:tc>
       </w:tr>
     </w:tbl>
-    <w:p/>
     <w:p>
       <w:pPr>
-        <w:keepNext/>
-        <w:spacing w:before="80" w:after="40"/>
+        <w:spacing w:before="0" w:after="0" w:line="276" w:lineRule="auto"/>
       </w:pPr>
       <w:r>
         <w:rPr>
-          <w:rFonts w:ascii="Times New Roman" w:hAnsi="Times New Roman" w:cs="Times New Roman" w:eastAsia="宋体" w:hint="eastAsia"/>
-          <w:b/>
-          <w:sz w:val="24"/>
-          <w:lang w:eastAsia="zh-CN"/>
+          <w:rFonts w:ascii="Times New Roman" w:hAnsi="Times New Roman" w:eastAsia="宋体"/>
+          <w:b w:val="0"/>
+          <w:sz w:val="20"/>
         </w:rPr>
-        <w:t>（4）综合英文技术沟通项目评分标准</w:t>
+        <w:t>期末考核形式：综合英文技术沟通考查（综合成果＋英文或中英双语汇报与问答＋个人核验）。</w:t>
       </w:r>
     </w:p>
-    <w:tbl>
-      <w:tblPr>
-        <w:tblW w:type="auto" w:w="0"/>
-        <w:jc w:val="center"/>
-        <w:tblLayout w:type="fixed"/>
-        <w:tblLook w:firstColumn="1" w:firstRow="1" w:lastColumn="0" w:lastRow="0" w:noHBand="0" w:noVBand="1" w:val="04A0"/>
-        <w:tblBorders>
-          <w:top w:val="single" w:sz="4" w:space="0" w:color="000000"/>
-          <w:left w:val="single" w:sz="4" w:space="0" w:color="000000"/>
-          <w:bottom w:val="single" w:sz="4" w:space="0" w:color="000000"/>
-          <w:right w:val="single" w:sz="4" w:space="0" w:color="000000"/>
-          <w:insideH w:val="single" w:sz="4" w:space="0" w:color="000000"/>
-          <w:insideV w:val="single" w:sz="4" w:space="0" w:color="000000"/>
-        </w:tblBorders>
-      </w:tblPr>
-      <w:tblGrid>
-        <w:gridCol w:w="1600"/>
-        <w:gridCol w:w="850"/>
-        <w:gridCol w:w="5050"/>
-        <w:gridCol w:w="1550"/>
-      </w:tblGrid>
-      <w:tr>
-        <w:trPr>
-          <w:tblHeader w:val="true"/>
-        </w:trPr>
-        <w:tc>
-          <w:tcPr>
-            <w:tcW w:type="dxa" w:w="1600"/>
-            <w:vAlign w:val="center"/>
-            <w:tcMar>
-              <w:top w:w="65" w:type="dxa"/>
-              <w:bottom w:w="65" w:type="dxa"/>
-              <w:start w:w="65" w:type="dxa"/>
-              <w:end w:w="65" w:type="dxa"/>
-            </w:tcMar>
-          </w:tcPr>
-          <w:p>
-            <w:pPr>
-              <w:spacing w:before="0" w:after="0" w:line="240" w:lineRule="auto"/>
-              <w:jc w:val="center"/>
-            </w:pPr>
-            <w:r/>
-            <w:r>
-              <w:rPr>
-                <w:rFonts w:ascii="Times New Roman" w:hAnsi="Times New Roman" w:cs="Times New Roman" w:eastAsia="宋体" w:hint="eastAsia"/>
-                <w:b/>
-                <w:sz w:val="16"/>
-                <w:lang w:eastAsia="zh-CN"/>
-              </w:rPr>
-              <w:t>考核内容</w:t>
-            </w:r>
-          </w:p>
-        </w:tc>
-        <w:tc>
-          <w:tcPr>
-            <w:tcW w:type="dxa" w:w="850"/>
-            <w:vAlign w:val="center"/>
-            <w:tcMar>
-              <w:top w:w="65" w:type="dxa"/>
-              <w:bottom w:w="65" w:type="dxa"/>
-              <w:start w:w="65" w:type="dxa"/>
-              <w:end w:w="65" w:type="dxa"/>
-            </w:tcMar>
-          </w:tcPr>
-          <w:p>
-            <w:pPr>
-              <w:spacing w:before="0" w:after="0" w:line="240" w:lineRule="auto"/>
-              <w:jc w:val="center"/>
-            </w:pPr>
-            <w:r/>
-            <w:r>
-              <w:rPr>
-                <w:rFonts w:ascii="Times New Roman" w:hAnsi="Times New Roman" w:cs="Times New Roman" w:eastAsia="宋体" w:hint="eastAsia"/>
-                <w:b/>
-                <w:sz w:val="16"/>
-                <w:lang w:eastAsia="zh-CN"/>
-              </w:rPr>
-              <w:t>成绩占比</w:t>
-            </w:r>
-          </w:p>
-        </w:tc>
-        <w:tc>
-          <w:tcPr>
-            <w:tcW w:type="dxa" w:w="5050"/>
-            <w:vAlign w:val="center"/>
-            <w:tcMar>
-              <w:top w:w="65" w:type="dxa"/>
-              <w:bottom w:w="65" w:type="dxa"/>
-              <w:start w:w="65" w:type="dxa"/>
-              <w:end w:w="65" w:type="dxa"/>
-            </w:tcMar>
-          </w:tcPr>
-          <w:p>
-            <w:pPr>
-              <w:spacing w:before="0" w:after="0" w:line="240" w:lineRule="auto"/>
-              <w:jc w:val="center"/>
-            </w:pPr>
-            <w:r/>
-            <w:r>
-              <w:rPr>
-                <w:rFonts w:ascii="Times New Roman" w:hAnsi="Times New Roman" w:cs="Times New Roman" w:eastAsia="宋体" w:hint="eastAsia"/>
-                <w:b/>
-                <w:sz w:val="16"/>
-                <w:lang w:eastAsia="zh-CN"/>
-              </w:rPr>
-              <w:t>考核目标与评分要求</w:t>
-            </w:r>
-          </w:p>
-        </w:tc>
-        <w:tc>
-          <w:tcPr>
-            <w:tcW w:type="dxa" w:w="1550"/>
-            <w:vAlign w:val="center"/>
-            <w:tcMar>
-              <w:top w:w="65" w:type="dxa"/>
-              <w:bottom w:w="65" w:type="dxa"/>
-              <w:start w:w="65" w:type="dxa"/>
-              <w:end w:w="65" w:type="dxa"/>
-            </w:tcMar>
-          </w:tcPr>
-          <w:p>
-            <w:pPr>
-              <w:spacing w:before="0" w:after="0" w:line="240" w:lineRule="auto"/>
-              <w:jc w:val="center"/>
-            </w:pPr>
-            <w:r/>
-            <w:r>
-              <w:rPr>
-                <w:rFonts w:ascii="Times New Roman" w:hAnsi="Times New Roman" w:cs="Times New Roman" w:eastAsia="宋体" w:hint="eastAsia"/>
-                <w:b/>
-                <w:sz w:val="16"/>
-                <w:lang w:eastAsia="zh-CN"/>
-              </w:rPr>
-              <w:t>课程目标</w:t>
-            </w:r>
-          </w:p>
-        </w:tc>
-      </w:tr>
-      <w:tr>
-        <w:trPr>
-          <w:cantSplit/>
-        </w:trPr>
-        <w:tc>
-          <w:tcPr>
-            <w:tcW w:type="dxa" w:w="1600"/>
-          </w:tcPr>
-          <w:p>
-            <w:pPr>
-              <w:spacing w:before="0" w:after="0" w:line="240" w:lineRule="auto"/>
-              <w:jc w:val="left"/>
-            </w:pPr>
-            <w:r/>
-            <w:r>
-              <w:rPr>
-                <w:rFonts w:ascii="Times New Roman" w:hAnsi="Times New Roman" w:cs="Times New Roman" w:eastAsia="宋体" w:hint="eastAsia"/>
-                <w:b w:val="0"/>
-                <w:sz w:val="16"/>
-                <w:lang w:eastAsia="zh-CN"/>
-              </w:rPr>
-              <w:t>主题与可靠来源</w:t>
-            </w:r>
-          </w:p>
-        </w:tc>
-        <w:tc>
-          <w:tcPr>
-            <w:tcW w:type="dxa" w:w="850"/>
-          </w:tcPr>
-          <w:p>
-            <w:pPr>
-              <w:spacing w:before="0" w:after="0" w:line="240" w:lineRule="auto"/>
-              <w:jc w:val="center"/>
-            </w:pPr>
-            <w:r/>
-            <w:r>
-              <w:rPr>
-                <w:rFonts w:ascii="Times New Roman" w:hAnsi="Times New Roman" w:cs="Times New Roman" w:eastAsia="宋体" w:hint="eastAsia"/>
-                <w:b w:val="0"/>
-                <w:sz w:val="16"/>
-                <w:lang w:eastAsia="zh-CN"/>
-              </w:rPr>
-              <w:t>15%</w:t>
-            </w:r>
-          </w:p>
-        </w:tc>
-        <w:tc>
-          <w:tcPr>
-            <w:tcW w:type="dxa" w:w="5050"/>
-          </w:tcPr>
-          <w:p>
-            <w:pPr>
-              <w:spacing w:before="0" w:after="0" w:line="240" w:lineRule="auto"/>
-              <w:jc w:val="left"/>
-            </w:pPr>
-            <w:r/>
-            <w:r>
-              <w:rPr>
-                <w:rFonts w:ascii="Times New Roman" w:hAnsi="Times New Roman" w:cs="Times New Roman" w:eastAsia="宋体" w:hint="eastAsia"/>
-                <w:b w:val="0"/>
-                <w:sz w:val="16"/>
-                <w:lang w:eastAsia="zh-CN"/>
-              </w:rPr>
-              <w:t>选择数控、机器人、增材制造、数字孪生、智能产线或预测性维护主题；中英文来源真实、相关、版本清楚。</w:t>
-            </w:r>
-          </w:p>
-        </w:tc>
-        <w:tc>
-          <w:tcPr>
-            <w:tcW w:type="dxa" w:w="1550"/>
-          </w:tcPr>
-          <w:p>
-            <w:pPr>
-              <w:spacing w:before="0" w:after="0" w:line="240" w:lineRule="auto"/>
-              <w:jc w:val="center"/>
-            </w:pPr>
-            <w:r/>
-            <w:r>
-              <w:rPr>
-                <w:rFonts w:ascii="Times New Roman" w:hAnsi="Times New Roman" w:cs="Times New Roman" w:eastAsia="宋体" w:hint="eastAsia"/>
-                <w:b w:val="0"/>
-                <w:sz w:val="16"/>
-                <w:lang w:eastAsia="zh-CN"/>
-              </w:rPr>
-              <w:t>目标 2.5，3.4，3.6</w:t>
-            </w:r>
-          </w:p>
-        </w:tc>
-      </w:tr>
-      <w:tr>
-        <w:trPr>
-          <w:cantSplit/>
-        </w:trPr>
-        <w:tc>
-          <w:tcPr>
-            <w:tcW w:type="dxa" w:w="1600"/>
-          </w:tcPr>
-          <w:p>
-            <w:pPr>
-              <w:spacing w:before="0" w:after="0" w:line="240" w:lineRule="auto"/>
-              <w:jc w:val="left"/>
-            </w:pPr>
-            <w:r/>
-            <w:r>
-              <w:rPr>
-                <w:rFonts w:ascii="Times New Roman" w:hAnsi="Times New Roman" w:cs="Times New Roman" w:eastAsia="宋体" w:hint="eastAsia"/>
-                <w:b w:val="0"/>
-                <w:sz w:val="16"/>
-                <w:lang w:eastAsia="zh-CN"/>
-              </w:rPr>
-              <w:t>双语术语库与阅读证据</w:t>
-            </w:r>
-          </w:p>
-        </w:tc>
-        <w:tc>
-          <w:tcPr>
-            <w:tcW w:type="dxa" w:w="850"/>
-          </w:tcPr>
-          <w:p>
-            <w:pPr>
-              <w:spacing w:before="0" w:after="0" w:line="240" w:lineRule="auto"/>
-              <w:jc w:val="center"/>
-            </w:pPr>
-            <w:r/>
-            <w:r>
-              <w:rPr>
-                <w:rFonts w:ascii="Times New Roman" w:hAnsi="Times New Roman" w:cs="Times New Roman" w:eastAsia="宋体" w:hint="eastAsia"/>
-                <w:b w:val="0"/>
-                <w:sz w:val="16"/>
-                <w:lang w:eastAsia="zh-CN"/>
-              </w:rPr>
-              <w:t>15%</w:t>
-            </w:r>
-          </w:p>
-        </w:tc>
-        <w:tc>
-          <w:tcPr>
-            <w:tcW w:type="dxa" w:w="5050"/>
-          </w:tcPr>
-          <w:p>
-            <w:pPr>
-              <w:spacing w:before="0" w:after="0" w:line="240" w:lineRule="auto"/>
-              <w:jc w:val="left"/>
-            </w:pPr>
-            <w:r/>
-            <w:r>
-              <w:rPr>
-                <w:rFonts w:ascii="Times New Roman" w:hAnsi="Times New Roman" w:cs="Times New Roman" w:eastAsia="宋体" w:hint="eastAsia"/>
-                <w:b w:val="0"/>
-                <w:sz w:val="16"/>
-                <w:lang w:eastAsia="zh-CN"/>
-              </w:rPr>
-              <w:t>术语表一致、定义和语境准确；关键事实、参数和结论能够定位到原文或图表。</w:t>
-            </w:r>
-          </w:p>
-        </w:tc>
-        <w:tc>
-          <w:tcPr>
-            <w:tcW w:type="dxa" w:w="1550"/>
-          </w:tcPr>
-          <w:p>
-            <w:pPr>
-              <w:spacing w:before="0" w:after="0" w:line="240" w:lineRule="auto"/>
-              <w:jc w:val="center"/>
-            </w:pPr>
-            <w:r/>
-            <w:r>
-              <w:rPr>
-                <w:rFonts w:ascii="Times New Roman" w:hAnsi="Times New Roman" w:cs="Times New Roman" w:eastAsia="宋体" w:hint="eastAsia"/>
-                <w:b w:val="0"/>
-                <w:sz w:val="16"/>
-                <w:lang w:eastAsia="zh-CN"/>
-              </w:rPr>
-              <w:t>目标 2.1，2.2，3.1</w:t>
-            </w:r>
-          </w:p>
-        </w:tc>
-      </w:tr>
-      <w:tr>
-        <w:trPr>
-          <w:cantSplit/>
-        </w:trPr>
-        <w:tc>
-          <w:tcPr>
-            <w:tcW w:type="dxa" w:w="1600"/>
-          </w:tcPr>
-          <w:p>
-            <w:pPr>
-              <w:spacing w:before="0" w:after="0" w:line="240" w:lineRule="auto"/>
-              <w:jc w:val="left"/>
-            </w:pPr>
-            <w:r/>
-            <w:r>
-              <w:rPr>
-                <w:rFonts w:ascii="Times New Roman" w:hAnsi="Times New Roman" w:cs="Times New Roman" w:eastAsia="宋体" w:hint="eastAsia"/>
-                <w:b w:val="0"/>
-                <w:sz w:val="16"/>
-                <w:lang w:eastAsia="zh-CN"/>
-              </w:rPr>
-              <w:t>技术系统/过程说明</w:t>
-            </w:r>
-          </w:p>
-        </w:tc>
-        <w:tc>
-          <w:tcPr>
-            <w:tcW w:type="dxa" w:w="850"/>
-          </w:tcPr>
-          <w:p>
-            <w:pPr>
-              <w:spacing w:before="0" w:after="0" w:line="240" w:lineRule="auto"/>
-              <w:jc w:val="center"/>
-            </w:pPr>
-            <w:r/>
-            <w:r>
-              <w:rPr>
-                <w:rFonts w:ascii="Times New Roman" w:hAnsi="Times New Roman" w:cs="Times New Roman" w:eastAsia="宋体" w:hint="eastAsia"/>
-                <w:b w:val="0"/>
-                <w:sz w:val="16"/>
-                <w:lang w:eastAsia="zh-CN"/>
-              </w:rPr>
-              <w:t>20%</w:t>
-            </w:r>
-          </w:p>
-        </w:tc>
-        <w:tc>
-          <w:tcPr>
-            <w:tcW w:type="dxa" w:w="5050"/>
-          </w:tcPr>
-          <w:p>
-            <w:pPr>
-              <w:spacing w:before="0" w:after="0" w:line="240" w:lineRule="auto"/>
-              <w:jc w:val="left"/>
-            </w:pPr>
-            <w:r/>
-            <w:r>
-              <w:rPr>
-                <w:rFonts w:ascii="Times New Roman" w:hAnsi="Times New Roman" w:cs="Times New Roman" w:eastAsia="宋体" w:hint="eastAsia"/>
-                <w:b w:val="0"/>
-                <w:sz w:val="16"/>
-                <w:lang w:eastAsia="zh-CN"/>
-              </w:rPr>
-              <w:t>能够用英文或中英双语说明对象、组成、工作过程、接口、性能、问题与改进，系统关系清楚。</w:t>
-            </w:r>
-          </w:p>
-        </w:tc>
-        <w:tc>
-          <w:tcPr>
-            <w:tcW w:type="dxa" w:w="1550"/>
-          </w:tcPr>
-          <w:p>
-            <w:pPr>
-              <w:spacing w:before="0" w:after="0" w:line="240" w:lineRule="auto"/>
-              <w:jc w:val="center"/>
-            </w:pPr>
-            <w:r/>
-            <w:r>
-              <w:rPr>
-                <w:rFonts w:ascii="Times New Roman" w:hAnsi="Times New Roman" w:cs="Times New Roman" w:eastAsia="宋体" w:hint="eastAsia"/>
-                <w:b w:val="0"/>
-                <w:sz w:val="16"/>
-                <w:lang w:eastAsia="zh-CN"/>
-              </w:rPr>
-              <w:t>目标 1.2—1.4，2.3，2.4，3.2</w:t>
-            </w:r>
-          </w:p>
-        </w:tc>
-      </w:tr>
-      <w:tr>
-        <w:trPr>
-          <w:cantSplit/>
-        </w:trPr>
-        <w:tc>
-          <w:tcPr>
-            <w:tcW w:type="dxa" w:w="1600"/>
-          </w:tcPr>
-          <w:p>
-            <w:pPr>
-              <w:spacing w:before="0" w:after="0" w:line="240" w:lineRule="auto"/>
-              <w:jc w:val="left"/>
-            </w:pPr>
-            <w:r/>
-            <w:r>
-              <w:rPr>
-                <w:rFonts w:ascii="Times New Roman" w:hAnsi="Times New Roman" w:cs="Times New Roman" w:eastAsia="宋体" w:hint="eastAsia"/>
-                <w:b w:val="0"/>
-                <w:sz w:val="16"/>
-                <w:lang w:eastAsia="zh-CN"/>
-              </w:rPr>
-              <w:t>技术文档与翻译质量</w:t>
-            </w:r>
-          </w:p>
-        </w:tc>
-        <w:tc>
-          <w:tcPr>
-            <w:tcW w:type="dxa" w:w="850"/>
-          </w:tcPr>
-          <w:p>
-            <w:pPr>
-              <w:spacing w:before="0" w:after="0" w:line="240" w:lineRule="auto"/>
-              <w:jc w:val="center"/>
-            </w:pPr>
-            <w:r/>
-            <w:r>
-              <w:rPr>
-                <w:rFonts w:ascii="Times New Roman" w:hAnsi="Times New Roman" w:cs="Times New Roman" w:eastAsia="宋体" w:hint="eastAsia"/>
-                <w:b w:val="0"/>
-                <w:sz w:val="16"/>
-                <w:lang w:eastAsia="zh-CN"/>
-              </w:rPr>
-              <w:t>20%</w:t>
-            </w:r>
-          </w:p>
-        </w:tc>
-        <w:tc>
-          <w:tcPr>
-            <w:tcW w:type="dxa" w:w="5050"/>
-          </w:tcPr>
-          <w:p>
-            <w:pPr>
-              <w:spacing w:before="0" w:after="0" w:line="240" w:lineRule="auto"/>
-              <w:jc w:val="left"/>
-            </w:pPr>
-            <w:r/>
-            <w:r>
-              <w:rPr>
-                <w:rFonts w:ascii="Times New Roman" w:hAnsi="Times New Roman" w:cs="Times New Roman" w:eastAsia="宋体" w:hint="eastAsia"/>
-                <w:b w:val="0"/>
-                <w:sz w:val="16"/>
-                <w:lang w:eastAsia="zh-CN"/>
-              </w:rPr>
-              <w:t>技术简介、摘要、图表说明、操作/安全/排故片段结构规范，翻译准确、简洁、一致。</w:t>
-            </w:r>
-          </w:p>
-        </w:tc>
-        <w:tc>
-          <w:tcPr>
-            <w:tcW w:type="dxa" w:w="1550"/>
-          </w:tcPr>
-          <w:p>
-            <w:pPr>
-              <w:spacing w:before="0" w:after="0" w:line="240" w:lineRule="auto"/>
-              <w:jc w:val="center"/>
-            </w:pPr>
-            <w:r/>
-            <w:r>
-              <w:rPr>
-                <w:rFonts w:ascii="Times New Roman" w:hAnsi="Times New Roman" w:cs="Times New Roman" w:eastAsia="宋体" w:hint="eastAsia"/>
-                <w:b w:val="0"/>
-                <w:sz w:val="16"/>
-                <w:lang w:eastAsia="zh-CN"/>
-              </w:rPr>
-              <w:t>目标 1.5，1.6，2.4—2.6，3.3</w:t>
-            </w:r>
-          </w:p>
-        </w:tc>
-      </w:tr>
-      <w:tr>
-        <w:trPr>
-          <w:cantSplit/>
-        </w:trPr>
-        <w:tc>
-          <w:tcPr>
-            <w:tcW w:type="dxa" w:w="1600"/>
-          </w:tcPr>
-          <w:p>
-            <w:pPr>
-              <w:spacing w:before="0" w:after="0" w:line="240" w:lineRule="auto"/>
-              <w:jc w:val="left"/>
-            </w:pPr>
-            <w:r/>
-            <w:r>
-              <w:rPr>
-                <w:rFonts w:ascii="Times New Roman" w:hAnsi="Times New Roman" w:cs="Times New Roman" w:eastAsia="宋体" w:hint="eastAsia"/>
-                <w:b w:val="0"/>
-                <w:sz w:val="16"/>
-                <w:lang w:eastAsia="zh-CN"/>
-              </w:rPr>
-              <w:t>英文/双语汇报与问答</w:t>
-            </w:r>
-          </w:p>
-        </w:tc>
-        <w:tc>
-          <w:tcPr>
-            <w:tcW w:type="dxa" w:w="850"/>
-          </w:tcPr>
-          <w:p>
-            <w:pPr>
-              <w:spacing w:before="0" w:after="0" w:line="240" w:lineRule="auto"/>
-              <w:jc w:val="center"/>
-            </w:pPr>
-            <w:r/>
-            <w:r>
-              <w:rPr>
-                <w:rFonts w:ascii="Times New Roman" w:hAnsi="Times New Roman" w:cs="Times New Roman" w:eastAsia="宋体" w:hint="eastAsia"/>
-                <w:b w:val="0"/>
-                <w:sz w:val="16"/>
-                <w:lang w:eastAsia="zh-CN"/>
-              </w:rPr>
-              <w:t>20%</w:t>
-            </w:r>
-          </w:p>
-        </w:tc>
-        <w:tc>
-          <w:tcPr>
-            <w:tcW w:type="dxa" w:w="5050"/>
-          </w:tcPr>
-          <w:p>
-            <w:pPr>
-              <w:spacing w:before="0" w:after="0" w:line="240" w:lineRule="auto"/>
-              <w:jc w:val="left"/>
-            </w:pPr>
-            <w:r/>
-            <w:r>
-              <w:rPr>
-                <w:rFonts w:ascii="Times New Roman" w:hAnsi="Times New Roman" w:cs="Times New Roman" w:eastAsia="宋体" w:hint="eastAsia"/>
-                <w:b w:val="0"/>
-                <w:sz w:val="16"/>
-                <w:lang w:eastAsia="zh-CN"/>
-              </w:rPr>
-              <w:t>演示结构清楚，图表有效，发音和表达可理解；能够回答技术问题、澄清信息并说明局限。</w:t>
-            </w:r>
-          </w:p>
-        </w:tc>
-        <w:tc>
-          <w:tcPr>
-            <w:tcW w:type="dxa" w:w="1550"/>
-          </w:tcPr>
-          <w:p>
-            <w:pPr>
-              <w:spacing w:before="0" w:after="0" w:line="240" w:lineRule="auto"/>
-              <w:jc w:val="center"/>
-            </w:pPr>
-            <w:r/>
-            <w:r>
-              <w:rPr>
-                <w:rFonts w:ascii="Times New Roman" w:hAnsi="Times New Roman" w:cs="Times New Roman" w:eastAsia="宋体" w:hint="eastAsia"/>
-                <w:b w:val="0"/>
-                <w:sz w:val="16"/>
-                <w:lang w:eastAsia="zh-CN"/>
-              </w:rPr>
-              <w:t>目标 2.6，3.5，3.6</w:t>
-            </w:r>
-          </w:p>
-        </w:tc>
-      </w:tr>
-      <w:tr>
-        <w:trPr>
-          <w:cantSplit/>
-        </w:trPr>
-        <w:tc>
-          <w:tcPr>
-            <w:tcW w:type="dxa" w:w="1600"/>
-          </w:tcPr>
-          <w:p>
-            <w:pPr>
-              <w:spacing w:before="0" w:after="0" w:line="240" w:lineRule="auto"/>
-              <w:jc w:val="left"/>
-            </w:pPr>
-            <w:r/>
-            <w:r>
-              <w:rPr>
-                <w:rFonts w:ascii="Times New Roman" w:hAnsi="Times New Roman" w:cs="Times New Roman" w:eastAsia="宋体" w:hint="eastAsia"/>
-                <w:b w:val="0"/>
-                <w:sz w:val="16"/>
-                <w:lang w:eastAsia="zh-CN"/>
-              </w:rPr>
-              <w:t>团队协作、版本与诚信</w:t>
-            </w:r>
-          </w:p>
-        </w:tc>
-        <w:tc>
-          <w:tcPr>
-            <w:tcW w:type="dxa" w:w="850"/>
-          </w:tcPr>
-          <w:p>
-            <w:pPr>
-              <w:spacing w:before="0" w:after="0" w:line="240" w:lineRule="auto"/>
-              <w:jc w:val="center"/>
-            </w:pPr>
-            <w:r/>
-            <w:r>
-              <w:rPr>
-                <w:rFonts w:ascii="Times New Roman" w:hAnsi="Times New Roman" w:cs="Times New Roman" w:eastAsia="宋体" w:hint="eastAsia"/>
-                <w:b w:val="0"/>
-                <w:sz w:val="16"/>
-                <w:lang w:eastAsia="zh-CN"/>
-              </w:rPr>
-              <w:t>10%</w:t>
-            </w:r>
-          </w:p>
-        </w:tc>
-        <w:tc>
-          <w:tcPr>
-            <w:tcW w:type="dxa" w:w="5050"/>
-          </w:tcPr>
-          <w:p>
-            <w:pPr>
-              <w:spacing w:before="0" w:after="0" w:line="240" w:lineRule="auto"/>
-              <w:jc w:val="left"/>
-            </w:pPr>
-            <w:r/>
-            <w:r>
-              <w:rPr>
-                <w:rFonts w:ascii="Times New Roman" w:hAnsi="Times New Roman" w:cs="Times New Roman" w:eastAsia="宋体" w:hint="eastAsia"/>
-                <w:b w:val="0"/>
-                <w:sz w:val="16"/>
-                <w:lang w:eastAsia="zh-CN"/>
-              </w:rPr>
-              <w:t>分工、版本、引用和工具/AI使用记录完整，个人贡献与现场解释一致。</w:t>
-            </w:r>
-          </w:p>
-        </w:tc>
-        <w:tc>
-          <w:tcPr>
-            <w:tcW w:type="dxa" w:w="1550"/>
-          </w:tcPr>
-          <w:p>
-            <w:pPr>
-              <w:spacing w:before="0" w:after="0" w:line="240" w:lineRule="auto"/>
-              <w:jc w:val="center"/>
-            </w:pPr>
-            <w:r/>
-            <w:r>
-              <w:rPr>
-                <w:rFonts w:ascii="Times New Roman" w:hAnsi="Times New Roman" w:cs="Times New Roman" w:eastAsia="宋体" w:hint="eastAsia"/>
-                <w:b w:val="0"/>
-                <w:sz w:val="16"/>
-                <w:lang w:eastAsia="zh-CN"/>
-              </w:rPr>
-              <w:t>目标 3.4，3.5，3.6</w:t>
-            </w:r>
-          </w:p>
-        </w:tc>
-      </w:tr>
-      <w:tr>
-        <w:tc>
-          <w:tcPr>
-            <w:tcW w:type="dxa" w:w="1600"/>
-          </w:tcPr>
-          <w:p>
-            <w:pPr>
-              <w:spacing w:before="0" w:after="0" w:line="240" w:lineRule="auto"/>
-              <w:jc w:val="center"/>
-            </w:pPr>
-            <w:r/>
-            <w:r>
-              <w:rPr>
-                <w:rFonts w:ascii="Times New Roman" w:hAnsi="Times New Roman" w:cs="Times New Roman" w:eastAsia="宋体" w:hint="eastAsia"/>
-                <w:b/>
-                <w:sz w:val="16"/>
-                <w:lang w:eastAsia="zh-CN"/>
-              </w:rPr>
-              <w:t>合计</w:t>
-            </w:r>
-          </w:p>
-        </w:tc>
-        <w:tc>
-          <w:tcPr>
-            <w:tcW w:type="dxa" w:w="850"/>
-          </w:tcPr>
-          <w:p>
-            <w:pPr>
-              <w:spacing w:before="0" w:after="0" w:line="240" w:lineRule="auto"/>
-              <w:jc w:val="center"/>
-            </w:pPr>
-            <w:r/>
-            <w:r>
-              <w:rPr>
-                <w:rFonts w:ascii="Times New Roman" w:hAnsi="Times New Roman" w:cs="Times New Roman" w:eastAsia="宋体" w:hint="eastAsia"/>
-                <w:b/>
-                <w:sz w:val="16"/>
-                <w:lang w:eastAsia="zh-CN"/>
-              </w:rPr>
-              <w:t>100%</w:t>
-            </w:r>
-          </w:p>
-        </w:tc>
-        <w:tc>
-          <w:tcPr>
-            <w:tcW w:type="dxa" w:w="5050"/>
-          </w:tcPr>
-          <w:p>
-            <w:pPr>
-              <w:spacing w:before="0" w:after="0" w:line="240" w:lineRule="auto"/>
-              <w:jc w:val="center"/>
-            </w:pPr>
-            <w:r/>
-            <w:r>
-              <w:rPr>
-                <w:rFonts w:ascii="Times New Roman" w:hAnsi="Times New Roman" w:cs="Times New Roman" w:eastAsia="宋体" w:hint="eastAsia"/>
-                <w:b/>
-                <w:sz w:val="16"/>
-                <w:lang w:eastAsia="zh-CN"/>
-              </w:rPr>
-            </w:r>
-          </w:p>
-        </w:tc>
-        <w:tc>
-          <w:tcPr>
-            <w:tcW w:type="dxa" w:w="1550"/>
-          </w:tcPr>
-          <w:p>
-            <w:pPr>
-              <w:spacing w:before="0" w:after="0" w:line="240" w:lineRule="auto"/>
-              <w:jc w:val="center"/>
-            </w:pPr>
-            <w:r/>
-            <w:r>
-              <w:rPr>
-                <w:rFonts w:ascii="Times New Roman" w:hAnsi="Times New Roman" w:cs="Times New Roman" w:eastAsia="宋体" w:hint="eastAsia"/>
-                <w:b/>
-                <w:sz w:val="16"/>
-                <w:lang w:eastAsia="zh-CN"/>
-              </w:rPr>
-            </w:r>
-          </w:p>
-        </w:tc>
-      </w:tr>
-    </w:tbl>
-    <w:p/>
     <w:p>
       <w:pPr>
         <w:keepNext/>

</xml_diff>